<commit_message>
docs: integrate soil NPK pH colorimetric standards into manual, latex book, research report, and update PDF
</commit_message>
<xml_diff>
--- a/chewa/chapters/ch02_literature_review.docx
+++ b/chewa/chapters/ch02_literature_review.docx
@@ -12,7 +12,7 @@
       </w:r>
     </w:p>
     <w:bookmarkEnd w:id="9"/>
-    <w:bookmarkStart w:id="31" w:name="วรรณกรรมและงานวจยทเกยวของ"/>
+    <w:bookmarkStart w:id="36" w:name="วรรณกรรมและงานวจยทเกยวของ"/>
     <w:p>
       <w:pPr>
         <w:pStyle w:val="Heading1"/>
@@ -26,7 +26,7 @@
         <w:pStyle w:val="FirstParagraph"/>
       </w:pPr>
       <w:r>
-        <w:t xml:space="preserve">การวิจัยเรื่องการพัฒนาชุดวิเคราะห์ปริมาณไนโตรเจนและฟอสฟอรัสในดินแบบพกพาด้วยหลักการสะท้อนแสงร่วมกับปัญญาประดิษฐ์ คณะผู้วิจัยได้ทำการทบทวนวรรณกรรม เอกสาร แนวคิด ทฤษฎีฟิสิกส์ และงานวิจัยที่เกี่ยวข้องทั้งในและต่างประเทศ โดยจำแนกเนื้อหาออกเป็น 6 หัวข้อหลัก ได้แก่</w:t>
+        <w:t xml:space="preserve">การวิจัยเรื่องการพัฒนาชุดวิเคราะห์ปริมาณไนโตรเจนและฟอสฟอรัสในดินแบบพกพาด้วยหลักการสะท้อนแสงร่วมกับปัญญาประดิษฐ์ คณะผู้วิจัยได้ทำการทบทวนวรรณกรรม เอกสาร แนวคิด ทฤษฎีฟิสิกส์ และงานวิจัยที่เกี่ยวข้องทั้งในและต่างประเทศ โดยจำแนกเนื้อหาออกเป็น 7 หัวข้อหลัก ได้แก่</w:t>
       </w:r>
     </w:p>
     <w:p>
@@ -99,6 +99,18 @@
       </w:pPr>
       <w:r>
         <w:t xml:space="preserve">งานวิจัยที่เกี่ยวข้องระดับสากลและกรอบแนวคิดการวิจัย</w:t>
+      </w:r>
+    </w:p>
+    <w:p>
+      <w:pPr>
+        <w:pStyle w:val="Compact"/>
+        <w:numPr>
+          <w:ilvl w:val="0"/>
+          <w:numId w:val="1001"/>
+        </w:numPr>
+      </w:pPr>
+      <w:r>
+        <w:t xml:space="preserve">การวิเคราะห์เคมีดินด้วยแถบสีเทียบเคียงและข้อจำกัดเชิงทัศนศาสตร์ (Colorimetric Soil Testing and Optical Constraints)</w:t>
       </w:r>
     </w:p>
     <w:p>
@@ -2876,9 +2888,4400 @@
         <w:t xml:space="preserve">+-----------------------------------------------------------------------------------+</w:t>
       </w:r>
     </w:p>
+    <w:p>
+      <w:r>
+        <w:pict>
+          <v:rect style="width:0;height:1.5pt" o:hralign="center" o:hrstd="t" o:hr="t"/>
+        </w:pict>
+      </w:r>
+    </w:p>
     <w:bookmarkEnd w:id="29"/>
     <w:bookmarkEnd w:id="30"/>
+    <w:bookmarkStart w:id="35" w:name="X0b94bb0e4c3e20aa76cf5e69e3057919405d123"/>
+    <w:p>
+      <w:pPr>
+        <w:pStyle w:val="Heading2"/>
+      </w:pPr>
+      <w:r>
+        <w:t xml:space="preserve">2.7 การวิเคราะห์เคมีดินด้วยแถบสีเทียบเคียงและข้อจำกัดเชิงทัศนศาสตร์</w:t>
+      </w:r>
+    </w:p>
+    <w:bookmarkStart w:id="31" w:name="X88ebb92e5df0e450d3b60cbacdd4ec196e563bb"/>
+    <w:p>
+      <w:pPr>
+        <w:pStyle w:val="Heading3"/>
+      </w:pPr>
+      <w:r>
+        <w:t xml:space="preserve">2.7.1 มาตรฐานชุดตรวจสอบดินภาคสนามเชิงสี (Colorimetric Soil Test Kits)</w:t>
+      </w:r>
+    </w:p>
+    <w:p>
+      <w:pPr>
+        <w:pStyle w:val="FirstParagraph"/>
+      </w:pPr>
+      <w:r>
+        <w:t xml:space="preserve">ในระบบเกษตรกรรมภาคสนามและงานส่งเสริมการเกษตรของประเทศไทย เกษตรกรและนักวิชาการเกษตรนิยมใช้ชุดตรวจสอบดินภาคสนาม (Soil Test Kit) ในการประเมินสถานะความอุดมสมบูรณ์ของดินเบื้องต้น เนื่องจากมีความสะดวก รวดเร็ว และทราบผลได้ทันทีในแปลงปลูก โดยชุดตรวจสอบที่ได้รับการยอมรับและอ้างอิงอย่างแพร่หลาย ได้แก่ ชุดตรวจสอบดินของกลุ่มวิจัยและพัฒนาการจัดการดินและปุ๋ย กรมพัฒนาที่ดิน กระทรวงเกษตรและสหกรณ์ (Land Development Department หรือ LDD) และชุดตรวจสอบดินมาตรฐานสากล LaMotte Combination Soil Testing Outfits (อาทิ Model STH Series และ Model 5934) ซึ่งอ้างอิงระเบียบวิธีวิเคราะห์ตามมาตรฐานของสมาคมวิทยาศาสตร์ทางดินแห่งสหรัฐอเมริกา (Soil Science Society of America หรือ SSSA) ตลอดจนชุดทดสอบ Rapitest Soil Test Kit</w:t>
+      </w:r>
+    </w:p>
+    <w:p>
+      <w:pPr>
+        <w:pStyle w:val="BodyText"/>
+      </w:pPr>
+      <w:r>
+        <w:t xml:space="preserve">ชุดตรวจสอบดังกล่าวอาศัยหลักการเทียบเคียงสี (Colorimetry) โดยการสกัดธาตุอาหารออกจากตัวอย่างดินด้วยน้ำยาสกัดเฉพาะ จากนั้นทำปฏิกิริยากับสารทำปฏิกิริยาเคมี (Chromogenic Reagents) เพื่อให้เกิดสารประกอบที่มีสี แล้วนำหลอดทดลองมาเปรียบเทียบความเข้มหรือเฉดสีด้วยสายตากับแผ่นแถบสีมาตรฐาน (Color Comparison Chart) ที่จัดพิมพ์มาพร้อมกับชุดทดสอบ</w:t>
+      </w:r>
+    </w:p>
     <w:bookmarkEnd w:id="31"/>
+    <w:bookmarkStart w:id="32" w:name="X727c3f48ab33a374783a569d1bc848988ef65db"/>
+    <w:p>
+      <w:pPr>
+        <w:pStyle w:val="Heading3"/>
+      </w:pPr>
+      <w:r>
+        <w:t xml:space="preserve">2.7.2 กลไกปฏิกิริยาเคมีวิเคราะห์และการเกิดสี (Chemical Reaction Mechanisms)</w:t>
+      </w:r>
+    </w:p>
+    <w:p>
+      <w:pPr>
+        <w:pStyle w:val="FirstParagraph"/>
+      </w:pPr>
+      <w:r>
+        <w:t xml:space="preserve">การเกิดสีของสารละลายทดสอบในแต่ละพารามิเตอร์ เป็นผลมาจากปฏิกิริยาเคมีวิเคราะห์จำเพาะ ดังนี้</w:t>
+      </w:r>
+    </w:p>
+    <w:p>
+      <w:pPr>
+        <w:numPr>
+          <w:ilvl w:val="0"/>
+          <w:numId w:val="1004"/>
+        </w:numPr>
+      </w:pPr>
+      <w:r>
+        <w:rPr>
+          <w:b/>
+          <w:bCs/>
+        </w:rPr>
+        <w:t xml:space="preserve">ความเป็นกรด-ด่างของดิน (Soil pH)</w:t>
+      </w:r>
+      <w:r>
+        <w:t xml:space="preserve"> </w:t>
+      </w:r>
+      <w:r>
+        <w:t xml:space="preserve">อาศัยปฏิกิริยาสมดุลของสารละลายอินดิเคเตอร์ผสมช่วงกว้าง (Wide-range Mixed Acid-Base Indicators) ซึ่งประกอบด้วยโบรโมครีซอลกรีน (Bromocresol Green) เมทิลเรด (Methyl Red) และโบรโมไทมอลบลู (Bromothymol Blue) เกิดการเปลี่ยนสีตามความเข้มข้นของไฮโดรเจนไอออนในสารละลายดินตามสมการ</w:t>
+      </w:r>
+    </w:p>
+    <w:p>
+      <w:pPr>
+        <w:pStyle w:val="BodyText"/>
+      </w:pPr>
+      <m:oMathPara>
+        <m:oMathParaPr>
+          <m:jc m:val="center"/>
+        </m:oMathParaPr>
+        <m:oMath>
+          <m:r>
+            <m:rPr>
+              <m:nor/>
+              <m:sty m:val="p"/>
+            </m:rPr>
+            <m:t>HIn</m:t>
+          </m:r>
+          <m:r>
+            <m:rPr>
+              <m:sty m:val="p"/>
+            </m:rPr>
+            <m:t>⇌</m:t>
+          </m:r>
+          <m:sSup>
+            <m:e>
+              <m:r>
+                <m:rPr>
+                  <m:nor/>
+                  <m:sty m:val="p"/>
+                </m:rPr>
+                <m:t>H</m:t>
+              </m:r>
+            </m:e>
+            <m:sup>
+              <m:r>
+                <m:rPr>
+                  <m:sty m:val="p"/>
+                </m:rPr>
+                <m:t>+</m:t>
+              </m:r>
+            </m:sup>
+          </m:sSup>
+          <m:r>
+            <m:rPr>
+              <m:sty m:val="p"/>
+            </m:rPr>
+            <m:t>+</m:t>
+          </m:r>
+          <m:sSup>
+            <m:e>
+              <m:r>
+                <m:rPr>
+                  <m:nor/>
+                  <m:sty m:val="p"/>
+                </m:rPr>
+                <m:t>In</m:t>
+              </m:r>
+            </m:e>
+            <m:sup>
+              <m:r>
+                <m:rPr>
+                  <m:sty m:val="p"/>
+                </m:rPr>
+                <m:t>−</m:t>
+              </m:r>
+            </m:sup>
+          </m:sSup>
+        </m:oMath>
+      </m:oMathPara>
+    </w:p>
+    <w:p>
+      <w:pPr>
+        <w:numPr>
+          <w:ilvl w:val="0"/>
+          <w:numId w:val="1000"/>
+        </w:numPr>
+      </w:pPr>
+      <w:r>
+        <w:t xml:space="preserve">สารละลายจะแสดงสีแดงส้มในสภาวะกรดจัดรุนแรง (</w:t>
+      </w:r>
+      <m:oMath>
+        <m:r>
+          <m:rPr>
+            <m:nor/>
+            <m:sty m:val="p"/>
+          </m:rPr>
+          <m:t>pH</m:t>
+        </m:r>
+        <m:r>
+          <m:rPr>
+            <m:sty m:val="p"/>
+          </m:rPr>
+          <m:t>&lt;</m:t>
+        </m:r>
+        <m:r>
+          <m:t>4.5</m:t>
+        </m:r>
+      </m:oMath>
+      <w:r>
+        <w:t xml:space="preserve">) และค่อยๆ เปลี่ยนเป็นสีส้มอมเหลือง (</w:t>
+      </w:r>
+      <m:oMath>
+        <m:r>
+          <m:rPr>
+            <m:nor/>
+            <m:sty m:val="p"/>
+          </m:rPr>
+          <m:t>pH </m:t>
+        </m:r>
+        <m:r>
+          <m:t>4.5</m:t>
+        </m:r>
+        <m:r>
+          <m:rPr>
+            <m:sty m:val="p"/>
+          </m:rPr>
+          <m:t>−</m:t>
+        </m:r>
+        <m:r>
+          <m:t>5.2</m:t>
+        </m:r>
+      </m:oMath>
+      <w:r>
+        <w:t xml:space="preserve">) สีเหลืองอมเขียว (</w:t>
+      </w:r>
+      <m:oMath>
+        <m:r>
+          <m:rPr>
+            <m:nor/>
+            <m:sty m:val="p"/>
+          </m:rPr>
+          <m:t>pH </m:t>
+        </m:r>
+        <m:r>
+          <m:t>5.3</m:t>
+        </m:r>
+        <m:r>
+          <m:rPr>
+            <m:sty m:val="p"/>
+          </m:rPr>
+          <m:t>−</m:t>
+        </m:r>
+        <m:r>
+          <m:t>6.0</m:t>
+        </m:r>
+      </m:oMath>
+      <w:r>
+        <w:t xml:space="preserve">) สีเขียวมรกตในดินที่มีค่าเป็นกลาง (</w:t>
+      </w:r>
+      <m:oMath>
+        <m:r>
+          <m:rPr>
+            <m:nor/>
+            <m:sty m:val="p"/>
+          </m:rPr>
+          <m:t>pH </m:t>
+        </m:r>
+        <m:r>
+          <m:t>6.5</m:t>
+        </m:r>
+        <m:r>
+          <m:rPr>
+            <m:sty m:val="p"/>
+          </m:rPr>
+          <m:t>−</m:t>
+        </m:r>
+        <m:r>
+          <m:t>7.5</m:t>
+        </m:r>
+      </m:oMath>
+      <w:r>
+        <w:t xml:space="preserve">) จนถึงสีน้ำเงินอมม่วงเข้มในสภาวะดินด่าง (</w:t>
+      </w:r>
+      <m:oMath>
+        <m:r>
+          <m:rPr>
+            <m:nor/>
+            <m:sty m:val="p"/>
+          </m:rPr>
+          <m:t>pH</m:t>
+        </m:r>
+        <m:r>
+          <m:rPr>
+            <m:sty m:val="p"/>
+          </m:rPr>
+          <m:t>&gt;</m:t>
+        </m:r>
+        <m:r>
+          <m:t>8.0</m:t>
+        </m:r>
+      </m:oMath>
+      <w:r>
+        <w:t xml:space="preserve">)</w:t>
+      </w:r>
+    </w:p>
+    <w:p>
+      <w:pPr>
+        <w:numPr>
+          <w:ilvl w:val="0"/>
+          <w:numId w:val="1004"/>
+        </w:numPr>
+      </w:pPr>
+      <w:r>
+        <w:rPr>
+          <w:b/>
+          <w:bCs/>
+        </w:rPr>
+        <w:t xml:space="preserve">ไนโตรเจนที่เป็นประโยชน์ในรูปไนเตรต (</w:t>
+      </w:r>
+      <m:oMath>
+        <m:sSubSup>
+          <m:e>
+            <m:r>
+              <m:rPr>
+                <m:nor/>
+                <m:sty m:val="p"/>
+              </m:rPr>
+              <m:t>NO</m:t>
+            </m:r>
+          </m:e>
+          <m:sub>
+            <m:r>
+              <m:t>3</m:t>
+            </m:r>
+          </m:sub>
+          <m:sup>
+            <m:r>
+              <m:rPr>
+                <m:sty m:val="p"/>
+              </m:rPr>
+              <m:t>−</m:t>
+            </m:r>
+          </m:sup>
+        </m:sSubSup>
+        <m:r>
+          <m:rPr>
+            <m:sty m:val="p"/>
+          </m:rPr>
+          <m:t>−</m:t>
+        </m:r>
+        <m:r>
+          <m:rPr>
+            <m:nor/>
+            <m:sty m:val="p"/>
+          </m:rPr>
+          <m:t>N</m:t>
+        </m:r>
+      </m:oMath>
+      <w:r>
+        <w:rPr>
+          <w:b/>
+          <w:bCs/>
+        </w:rPr>
+        <w:t xml:space="preserve">)</w:t>
+      </w:r>
+      <w:r>
+        <w:t xml:space="preserve"> </w:t>
+      </w:r>
+      <w:r>
+        <w:t xml:space="preserve">อาศัยปฏิกิริยากรีสส์ประยุกต์ (Modified Griess Reaction หรือ Zinc Reduction Method) โดยในขั้นแรกผงโลหะสังกะสี (</w:t>
+      </w:r>
+      <m:oMath>
+        <m:r>
+          <m:rPr>
+            <m:nor/>
+            <m:sty m:val="p"/>
+          </m:rPr>
+          <m:t>Zn</m:t>
+        </m:r>
+      </m:oMath>
+      <w:r>
+        <w:t xml:space="preserve">) จะทำหน้าที่รีดิวซ์ไนเตรตไอออนในสารละลายสกัดให้เปลี่ยนเป็นไนไตรต์ไอออน (</w:t>
+      </w:r>
+      <m:oMath>
+        <m:sSubSup>
+          <m:e>
+            <m:r>
+              <m:rPr>
+                <m:nor/>
+                <m:sty m:val="p"/>
+              </m:rPr>
+              <m:t>NO</m:t>
+            </m:r>
+          </m:e>
+          <m:sub>
+            <m:r>
+              <m:t>2</m:t>
+            </m:r>
+          </m:sub>
+          <m:sup>
+            <m:r>
+              <m:rPr>
+                <m:sty m:val="p"/>
+              </m:rPr>
+              <m:t>−</m:t>
+            </m:r>
+          </m:sup>
+        </m:sSubSup>
+      </m:oMath>
+      <w:r>
+        <w:t xml:space="preserve">) ภายใต้สภาวะกรด จากนั้นไนไตรต์จะทำปฏิกิริยาไดอะโซไทเซชัน (Diazotization) กับกรดซัลฟานิลิก (Sulfanilic Acid) เกิดเป็นเกลือไดอะโซเนียม และทำปฏิกิริยาคัปปลิง (Azo Coupling) กับสาร N-(1-Naphthyl)ethylenediamine dihydrochloride (NED) เกิดเป็นสีย้อมเอโซ (Azo Dye) สีชมพูแดง ซึ่งมีแถบดูดกลืนแสงสูงสุดที่ความยาวคลื่นประมาณ 540 นาโนเมตร ดังสมการเคมี</w:t>
+      </w:r>
+    </w:p>
+    <w:p>
+      <w:pPr>
+        <w:pStyle w:val="BodyText"/>
+      </w:pPr>
+      <m:oMathPara>
+        <m:oMathParaPr>
+          <m:jc m:val="center"/>
+        </m:oMathParaPr>
+        <m:oMath>
+          <m:sSubSup>
+            <m:e>
+              <m:r>
+                <m:rPr>
+                  <m:nor/>
+                  <m:sty m:val="p"/>
+                </m:rPr>
+                <m:t>NO</m:t>
+              </m:r>
+            </m:e>
+            <m:sub>
+              <m:r>
+                <m:t>3</m:t>
+              </m:r>
+            </m:sub>
+            <m:sup>
+              <m:r>
+                <m:rPr>
+                  <m:sty m:val="p"/>
+                </m:rPr>
+                <m:t>−</m:t>
+              </m:r>
+            </m:sup>
+          </m:sSubSup>
+          <m:r>
+            <m:rPr>
+              <m:sty m:val="p"/>
+            </m:rPr>
+            <m:t>+</m:t>
+          </m:r>
+          <m:r>
+            <m:rPr>
+              <m:nor/>
+              <m:sty m:val="p"/>
+            </m:rPr>
+            <m:t>Zn</m:t>
+          </m:r>
+          <m:r>
+            <m:rPr>
+              <m:sty m:val="p"/>
+            </m:rPr>
+            <m:t>+</m:t>
+          </m:r>
+          <m:r>
+            <m:t>2</m:t>
+          </m:r>
+          <m:sSup>
+            <m:e>
+              <m:r>
+                <m:rPr>
+                  <m:nor/>
+                  <m:sty m:val="p"/>
+                </m:rPr>
+                <m:t>H</m:t>
+              </m:r>
+            </m:e>
+            <m:sup>
+              <m:r>
+                <m:rPr>
+                  <m:sty m:val="p"/>
+                </m:rPr>
+                <m:t>+</m:t>
+              </m:r>
+            </m:sup>
+          </m:sSup>
+          <m:r>
+            <m:rPr>
+              <m:sty m:val="p"/>
+            </m:rPr>
+            <m:t>→</m:t>
+          </m:r>
+          <m:sSubSup>
+            <m:e>
+              <m:r>
+                <m:rPr>
+                  <m:nor/>
+                  <m:sty m:val="p"/>
+                </m:rPr>
+                <m:t>NO</m:t>
+              </m:r>
+            </m:e>
+            <m:sub>
+              <m:r>
+                <m:t>2</m:t>
+              </m:r>
+            </m:sub>
+            <m:sup>
+              <m:r>
+                <m:rPr>
+                  <m:sty m:val="p"/>
+                </m:rPr>
+                <m:t>−</m:t>
+              </m:r>
+            </m:sup>
+          </m:sSubSup>
+          <m:r>
+            <m:rPr>
+              <m:sty m:val="p"/>
+            </m:rPr>
+            <m:t>+</m:t>
+          </m:r>
+          <m:sSup>
+            <m:e>
+              <m:r>
+                <m:rPr>
+                  <m:nor/>
+                  <m:sty m:val="p"/>
+                </m:rPr>
+                <m:t>Zn</m:t>
+              </m:r>
+            </m:e>
+            <m:sup>
+              <m:r>
+                <m:t>2</m:t>
+              </m:r>
+              <m:r>
+                <m:rPr>
+                  <m:sty m:val="p"/>
+                </m:rPr>
+                <m:t>+</m:t>
+              </m:r>
+            </m:sup>
+          </m:sSup>
+          <m:r>
+            <m:rPr>
+              <m:sty m:val="p"/>
+            </m:rPr>
+            <m:t>+</m:t>
+          </m:r>
+          <m:sSub>
+            <m:e>
+              <m:r>
+                <m:rPr>
+                  <m:nor/>
+                  <m:sty m:val="p"/>
+                </m:rPr>
+                <m:t>H</m:t>
+              </m:r>
+            </m:e>
+            <m:sub>
+              <m:r>
+                <m:t>2</m:t>
+              </m:r>
+            </m:sub>
+          </m:sSub>
+          <m:r>
+            <m:rPr>
+              <m:nor/>
+              <m:sty m:val="p"/>
+            </m:rPr>
+            <m:t>O</m:t>
+          </m:r>
+        </m:oMath>
+      </m:oMathPara>
+    </w:p>
+    <w:p>
+      <w:pPr>
+        <w:pStyle w:val="FirstParagraph"/>
+      </w:pPr>
+      <m:oMathPara>
+        <m:oMathParaPr>
+          <m:jc m:val="center"/>
+        </m:oMathParaPr>
+        <m:oMath>
+          <m:sSubSup>
+            <m:e>
+              <m:r>
+                <m:rPr>
+                  <m:nor/>
+                  <m:sty m:val="p"/>
+                </m:rPr>
+                <m:t>NO</m:t>
+              </m:r>
+            </m:e>
+            <m:sub>
+              <m:r>
+                <m:t>2</m:t>
+              </m:r>
+            </m:sub>
+            <m:sup>
+              <m:r>
+                <m:rPr>
+                  <m:sty m:val="p"/>
+                </m:rPr>
+                <m:t>−</m:t>
+              </m:r>
+            </m:sup>
+          </m:sSubSup>
+          <m:r>
+            <m:rPr>
+              <m:sty m:val="p"/>
+            </m:rPr>
+            <m:t>+</m:t>
+          </m:r>
+          <m:sSub>
+            <m:e>
+              <m:r>
+                <m:rPr>
+                  <m:nor/>
+                  <m:sty m:val="p"/>
+                </m:rPr>
+                <m:t>Ar-NH</m:t>
+              </m:r>
+            </m:e>
+            <m:sub>
+              <m:r>
+                <m:t>2</m:t>
+              </m:r>
+            </m:sub>
+          </m:sSub>
+          <m:r>
+            <m:rPr>
+              <m:sty m:val="p"/>
+            </m:rPr>
+            <m:t>+</m:t>
+          </m:r>
+          <m:r>
+            <m:t>2</m:t>
+          </m:r>
+          <m:sSup>
+            <m:e>
+              <m:r>
+                <m:rPr>
+                  <m:nor/>
+                  <m:sty m:val="p"/>
+                </m:rPr>
+                <m:t>H</m:t>
+              </m:r>
+            </m:e>
+            <m:sup>
+              <m:r>
+                <m:rPr>
+                  <m:sty m:val="p"/>
+                </m:rPr>
+                <m:t>+</m:t>
+              </m:r>
+            </m:sup>
+          </m:sSup>
+          <m:r>
+            <m:rPr>
+              <m:sty m:val="p"/>
+            </m:rPr>
+            <m:t>→</m:t>
+          </m:r>
+          <m:r>
+            <m:rPr>
+              <m:sty m:val="p"/>
+            </m:rPr>
+            <m:t>[</m:t>
+          </m:r>
+          <m:sSup>
+            <m:e>
+              <m:r>
+                <m:rPr>
+                  <m:nor/>
+                  <m:sty m:val="p"/>
+                </m:rPr>
+                <m:t>Ar-N</m:t>
+              </m:r>
+            </m:e>
+            <m:sup>
+              <m:r>
+                <m:rPr>
+                  <m:sty m:val="p"/>
+                </m:rPr>
+                <m:t>+</m:t>
+              </m:r>
+            </m:sup>
+          </m:sSup>
+          <m:r>
+            <m:rPr>
+              <m:sty m:val="p"/>
+            </m:rPr>
+            <m:t>≡</m:t>
+          </m:r>
+          <m:r>
+            <m:rPr>
+              <m:nor/>
+              <m:sty m:val="p"/>
+            </m:rPr>
+            <m:t>N</m:t>
+          </m:r>
+          <m:r>
+            <m:rPr>
+              <m:sty m:val="p"/>
+            </m:rPr>
+            <m:t>]</m:t>
+          </m:r>
+          <m:r>
+            <m:rPr>
+              <m:sty m:val="p"/>
+            </m:rPr>
+            <m:t>+</m:t>
+          </m:r>
+          <m:r>
+            <m:t>2</m:t>
+          </m:r>
+          <m:sSub>
+            <m:e>
+              <m:r>
+                <m:rPr>
+                  <m:nor/>
+                  <m:sty m:val="p"/>
+                </m:rPr>
+                <m:t>H</m:t>
+              </m:r>
+            </m:e>
+            <m:sub>
+              <m:r>
+                <m:t>2</m:t>
+              </m:r>
+            </m:sub>
+          </m:sSub>
+          <m:r>
+            <m:rPr>
+              <m:nor/>
+              <m:sty m:val="p"/>
+            </m:rPr>
+            <m:t>O</m:t>
+          </m:r>
+        </m:oMath>
+      </m:oMathPara>
+    </w:p>
+    <w:p>
+      <w:pPr>
+        <w:pStyle w:val="FirstParagraph"/>
+      </w:pPr>
+      <m:oMathPara>
+        <m:oMathParaPr>
+          <m:jc m:val="center"/>
+        </m:oMathParaPr>
+        <m:oMath>
+          <m:r>
+            <m:rPr>
+              <m:sty m:val="p"/>
+            </m:rPr>
+            <m:t>[</m:t>
+          </m:r>
+          <m:sSup>
+            <m:e>
+              <m:r>
+                <m:rPr>
+                  <m:nor/>
+                  <m:sty m:val="p"/>
+                </m:rPr>
+                <m:t>Ar-N</m:t>
+              </m:r>
+            </m:e>
+            <m:sup>
+              <m:r>
+                <m:rPr>
+                  <m:sty m:val="p"/>
+                </m:rPr>
+                <m:t>+</m:t>
+              </m:r>
+            </m:sup>
+          </m:sSup>
+          <m:r>
+            <m:rPr>
+              <m:sty m:val="p"/>
+            </m:rPr>
+            <m:t>≡</m:t>
+          </m:r>
+          <m:r>
+            <m:rPr>
+              <m:nor/>
+              <m:sty m:val="p"/>
+            </m:rPr>
+            <m:t>N</m:t>
+          </m:r>
+          <m:r>
+            <m:rPr>
+              <m:sty m:val="p"/>
+            </m:rPr>
+            <m:t>]</m:t>
+          </m:r>
+          <m:r>
+            <m:rPr>
+              <m:sty m:val="p"/>
+            </m:rPr>
+            <m:t>+</m:t>
+          </m:r>
+          <m:sSup>
+            <m:e>
+              <m:r>
+                <m:rPr>
+                  <m:nor/>
+                  <m:sty m:val="p"/>
+                </m:rPr>
+                <m:t>Ar</m:t>
+              </m:r>
+            </m:e>
+            <m:sup>
+              <m:r>
+                <m:rPr>
+                  <m:sty m:val="p"/>
+                </m:rPr>
+                <m:t>′</m:t>
+              </m:r>
+            </m:sup>
+          </m:sSup>
+          <m:sSub>
+            <m:e>
+              <m:r>
+                <m:rPr>
+                  <m:nor/>
+                  <m:sty m:val="p"/>
+                </m:rPr>
+                <m:t>-NH(CH</m:t>
+              </m:r>
+            </m:e>
+            <m:sub>
+              <m:r>
+                <m:t>2</m:t>
+              </m:r>
+            </m:sub>
+          </m:sSub>
+          <m:sSub>
+            <m:e>
+              <m:r>
+                <m:rPr>
+                  <m:sty m:val="p"/>
+                </m:rPr>
+                <m:t>)</m:t>
+              </m:r>
+            </m:e>
+            <m:sub>
+              <m:r>
+                <m:t>2</m:t>
+              </m:r>
+            </m:sub>
+          </m:sSub>
+          <m:sSub>
+            <m:e>
+              <m:r>
+                <m:rPr>
+                  <m:nor/>
+                  <m:sty m:val="p"/>
+                </m:rPr>
+                <m:t>NH</m:t>
+              </m:r>
+            </m:e>
+            <m:sub>
+              <m:r>
+                <m:t>2</m:t>
+              </m:r>
+            </m:sub>
+          </m:sSub>
+          <m:r>
+            <m:rPr>
+              <m:sty m:val="p"/>
+            </m:rPr>
+            <m:t>→</m:t>
+          </m:r>
+          <m:sSup>
+            <m:e>
+              <m:r>
+                <m:rPr>
+                  <m:nor/>
+                  <m:sty m:val="p"/>
+                </m:rPr>
+                <m:t>Ar-N=N-Ar</m:t>
+              </m:r>
+            </m:e>
+            <m:sup>
+              <m:r>
+                <m:rPr>
+                  <m:sty m:val="p"/>
+                </m:rPr>
+                <m:t>′</m:t>
+              </m:r>
+            </m:sup>
+          </m:sSup>
+          <m:sSub>
+            <m:e>
+              <m:r>
+                <m:rPr>
+                  <m:nor/>
+                  <m:sty m:val="p"/>
+                </m:rPr>
+                <m:t>-NH(CH</m:t>
+              </m:r>
+            </m:e>
+            <m:sub>
+              <m:r>
+                <m:t>2</m:t>
+              </m:r>
+            </m:sub>
+          </m:sSub>
+          <m:sSub>
+            <m:e>
+              <m:r>
+                <m:rPr>
+                  <m:sty m:val="p"/>
+                </m:rPr>
+                <m:t>)</m:t>
+              </m:r>
+            </m:e>
+            <m:sub>
+              <m:r>
+                <m:t>2</m:t>
+              </m:r>
+            </m:sub>
+          </m:sSub>
+          <m:sSub>
+            <m:e>
+              <m:r>
+                <m:rPr>
+                  <m:nor/>
+                  <m:sty m:val="p"/>
+                </m:rPr>
+                <m:t>NH</m:t>
+              </m:r>
+            </m:e>
+            <m:sub>
+              <m:r>
+                <m:t>2</m:t>
+              </m:r>
+            </m:sub>
+          </m:sSub>
+        </m:oMath>
+      </m:oMathPara>
+    </w:p>
+    <w:p>
+      <w:pPr>
+        <w:numPr>
+          <w:ilvl w:val="0"/>
+          <w:numId w:val="1000"/>
+        </w:numPr>
+      </w:pPr>
+      <w:r>
+        <w:t xml:space="preserve">ความเข้มของสีชมพูแดงจะแปรผันตรงตามความเข้มข้นของไนเตรต โดยดินที่มีไนโตรเจนต่ำมากจะแสดงสารละลายใสหรือสีเหลืองจาง ขณะที่ดินที่มีไนโตรเจนสูงมากจะแสดงสีแดงอมม่วงเข้ม</w:t>
+      </w:r>
+    </w:p>
+    <w:p>
+      <w:pPr>
+        <w:numPr>
+          <w:ilvl w:val="0"/>
+          <w:numId w:val="1004"/>
+        </w:numPr>
+      </w:pPr>
+      <w:r>
+        <w:rPr>
+          <w:b/>
+          <w:bCs/>
+        </w:rPr>
+        <w:t xml:space="preserve">ฟอสฟอรัสที่เป็นประโยชน์ (Available Phosphorus)</w:t>
+      </w:r>
+      <w:r>
+        <w:t xml:space="preserve"> </w:t>
+      </w:r>
+      <w:r>
+        <w:t xml:space="preserve">อาศัยปฏิกิริยาโมลิบดีนัมบลู (Molybdenum Blue Method ร่วมกับวิธีสกัด Bray II) โดยออร์โธฟอสเฟตไอออน (</w:t>
+      </w:r>
+      <m:oMath>
+        <m:sSub>
+          <m:e>
+            <m:r>
+              <m:rPr>
+                <m:nor/>
+                <m:sty m:val="p"/>
+              </m:rPr>
+              <m:t>H</m:t>
+            </m:r>
+          </m:e>
+          <m:sub>
+            <m:r>
+              <m:t>2</m:t>
+            </m:r>
+          </m:sub>
+        </m:sSub>
+        <m:sSubSup>
+          <m:e>
+            <m:r>
+              <m:rPr>
+                <m:nor/>
+                <m:sty m:val="p"/>
+              </m:rPr>
+              <m:t>PO</m:t>
+            </m:r>
+          </m:e>
+          <m:sub>
+            <m:r>
+              <m:t>4</m:t>
+            </m:r>
+          </m:sub>
+          <m:sup>
+            <m:r>
+              <m:rPr>
+                <m:sty m:val="p"/>
+              </m:rPr>
+              <m:t>−</m:t>
+            </m:r>
+          </m:sup>
+        </m:sSubSup>
+      </m:oMath>
+      <w:r>
+        <w:t xml:space="preserve">) ทำปฏิกิริยากับแอมโมเนียมโมลิบเดต</w:t>
+      </w:r>
+      <w:r>
+        <w:t xml:space="preserve"> </w:t>
+      </w:r>
+      <m:oMath>
+        <m:r>
+          <m:rPr>
+            <m:sty m:val="p"/>
+          </m:rPr>
+          <m:t>[</m:t>
+        </m:r>
+        <m:r>
+          <m:rPr>
+            <m:sty m:val="p"/>
+          </m:rPr>
+          <m:t>(</m:t>
+        </m:r>
+        <m:sSub>
+          <m:e>
+            <m:r>
+              <m:rPr>
+                <m:nor/>
+                <m:sty m:val="p"/>
+              </m:rPr>
+              <m:t>NH</m:t>
+            </m:r>
+          </m:e>
+          <m:sub>
+            <m:r>
+              <m:t>4</m:t>
+            </m:r>
+          </m:sub>
+        </m:sSub>
+        <m:sSub>
+          <m:e>
+            <m:r>
+              <m:rPr>
+                <m:sty m:val="p"/>
+              </m:rPr>
+              <m:t>)</m:t>
+            </m:r>
+          </m:e>
+          <m:sub>
+            <m:r>
+              <m:t>6</m:t>
+            </m:r>
+          </m:sub>
+        </m:sSub>
+        <m:sSub>
+          <m:e>
+            <m:r>
+              <m:rPr>
+                <m:nor/>
+                <m:sty m:val="p"/>
+              </m:rPr>
+              <m:t>Mo</m:t>
+            </m:r>
+          </m:e>
+          <m:sub>
+            <m:r>
+              <m:t>7</m:t>
+            </m:r>
+          </m:sub>
+        </m:sSub>
+        <m:sSub>
+          <m:e>
+            <m:r>
+              <m:rPr>
+                <m:nor/>
+                <m:sty m:val="p"/>
+              </m:rPr>
+              <m:t>O</m:t>
+            </m:r>
+          </m:e>
+          <m:sub>
+            <m:r>
+              <m:t>24</m:t>
+            </m:r>
+          </m:sub>
+        </m:sSub>
+        <m:r>
+          <m:rPr>
+            <m:sty m:val="p"/>
+          </m:rPr>
+          <m:t>]</m:t>
+        </m:r>
+      </m:oMath>
+      <w:r>
+        <w:t xml:space="preserve"> </w:t>
+      </w:r>
+      <w:r>
+        <w:t xml:space="preserve">และโพแทสเซียมแอนติโมนีลทาร์เทรตในสารละลายกรดซัลฟิวริก เกิดเป็นกรดฟอสโฟโมลิบดิก จากนั้นถูกรีดิวซ์ด้วยกรดแอสคอร์บิก (Ascorbic Acid) เกิดเป็นสารประกอบเชิงซ้อนเฮเทอโรโพลีแอนไอออนสีน้ำเงินเข้ม (Phosphomolybdenum Blue Complex) ที่มีแถบดูดกลืนแสงสูงสุดที่ 660 นาโนเมตร และ 882 นาโนเมตร ดังสมการเคมี</w:t>
+      </w:r>
+    </w:p>
+    <w:p>
+      <w:pPr>
+        <w:pStyle w:val="BodyText"/>
+      </w:pPr>
+      <m:oMathPara>
+        <m:oMathParaPr>
+          <m:jc m:val="center"/>
+        </m:oMathParaPr>
+        <m:oMath>
+          <m:sSub>
+            <m:e>
+              <m:r>
+                <m:rPr>
+                  <m:nor/>
+                  <m:sty m:val="p"/>
+                </m:rPr>
+                <m:t>H</m:t>
+              </m:r>
+            </m:e>
+            <m:sub>
+              <m:r>
+                <m:t>2</m:t>
+              </m:r>
+            </m:sub>
+          </m:sSub>
+          <m:sSubSup>
+            <m:e>
+              <m:r>
+                <m:rPr>
+                  <m:nor/>
+                  <m:sty m:val="p"/>
+                </m:rPr>
+                <m:t>PO</m:t>
+              </m:r>
+            </m:e>
+            <m:sub>
+              <m:r>
+                <m:t>4</m:t>
+              </m:r>
+            </m:sub>
+            <m:sup>
+              <m:r>
+                <m:rPr>
+                  <m:sty m:val="p"/>
+                </m:rPr>
+                <m:t>−</m:t>
+              </m:r>
+            </m:sup>
+          </m:sSubSup>
+          <m:r>
+            <m:rPr>
+              <m:sty m:val="p"/>
+            </m:rPr>
+            <m:t>+</m:t>
+          </m:r>
+          <m:r>
+            <m:t>12</m:t>
+          </m:r>
+          <m:sSubSup>
+            <m:e>
+              <m:r>
+                <m:rPr>
+                  <m:nor/>
+                  <m:sty m:val="p"/>
+                </m:rPr>
+                <m:t>MoO</m:t>
+              </m:r>
+            </m:e>
+            <m:sub>
+              <m:r>
+                <m:t>4</m:t>
+              </m:r>
+            </m:sub>
+            <m:sup>
+              <m:r>
+                <m:t>2</m:t>
+              </m:r>
+              <m:r>
+                <m:rPr>
+                  <m:sty m:val="p"/>
+                </m:rPr>
+                <m:t>−</m:t>
+              </m:r>
+            </m:sup>
+          </m:sSubSup>
+          <m:r>
+            <m:rPr>
+              <m:sty m:val="p"/>
+            </m:rPr>
+            <m:t>+</m:t>
+          </m:r>
+          <m:r>
+            <m:t>22</m:t>
+          </m:r>
+          <m:sSup>
+            <m:e>
+              <m:r>
+                <m:rPr>
+                  <m:nor/>
+                  <m:sty m:val="p"/>
+                </m:rPr>
+                <m:t>H</m:t>
+              </m:r>
+            </m:e>
+            <m:sup>
+              <m:r>
+                <m:rPr>
+                  <m:sty m:val="p"/>
+                </m:rPr>
+                <m:t>+</m:t>
+              </m:r>
+            </m:sup>
+          </m:sSup>
+          <m:r>
+            <m:rPr>
+              <m:sty m:val="p"/>
+            </m:rPr>
+            <m:t>→</m:t>
+          </m:r>
+          <m:r>
+            <m:rPr>
+              <m:sty m:val="p"/>
+            </m:rPr>
+            <m:t>[</m:t>
+          </m:r>
+          <m:sSub>
+            <m:e>
+              <m:r>
+                <m:rPr>
+                  <m:nor/>
+                  <m:sty m:val="p"/>
+                </m:rPr>
+                <m:t>H</m:t>
+              </m:r>
+            </m:e>
+            <m:sub>
+              <m:r>
+                <m:t>2</m:t>
+              </m:r>
+            </m:sub>
+          </m:sSub>
+          <m:r>
+            <m:rPr>
+              <m:nor/>
+              <m:sty m:val="p"/>
+            </m:rPr>
+            <m:t>P</m:t>
+          </m:r>
+          <m:r>
+            <m:rPr>
+              <m:sty m:val="p"/>
+            </m:rPr>
+            <m:t>(</m:t>
+          </m:r>
+          <m:sSub>
+            <m:e>
+              <m:r>
+                <m:rPr>
+                  <m:nor/>
+                  <m:sty m:val="p"/>
+                </m:rPr>
+                <m:t>Mo</m:t>
+              </m:r>
+            </m:e>
+            <m:sub>
+              <m:r>
+                <m:t>12</m:t>
+              </m:r>
+            </m:sub>
+          </m:sSub>
+          <m:sSub>
+            <m:e>
+              <m:r>
+                <m:rPr>
+                  <m:nor/>
+                  <m:sty m:val="p"/>
+                </m:rPr>
+                <m:t>O</m:t>
+              </m:r>
+            </m:e>
+            <m:sub>
+              <m:r>
+                <m:t>40</m:t>
+              </m:r>
+            </m:sub>
+          </m:sSub>
+          <m:r>
+            <m:rPr>
+              <m:sty m:val="p"/>
+            </m:rPr>
+            <m:t>)</m:t>
+          </m:r>
+          <m:sSup>
+            <m:e>
+              <m:r>
+                <m:rPr>
+                  <m:sty m:val="p"/>
+                </m:rPr>
+                <m:t>]</m:t>
+              </m:r>
+            </m:e>
+            <m:sup>
+              <m:r>
+                <m:rPr>
+                  <m:sty m:val="p"/>
+                </m:rPr>
+                <m:t>−</m:t>
+              </m:r>
+            </m:sup>
+          </m:sSup>
+          <m:r>
+            <m:rPr>
+              <m:sty m:val="p"/>
+            </m:rPr>
+            <m:t>+</m:t>
+          </m:r>
+          <m:r>
+            <m:t>10</m:t>
+          </m:r>
+          <m:sSub>
+            <m:e>
+              <m:r>
+                <m:rPr>
+                  <m:nor/>
+                  <m:sty m:val="p"/>
+                </m:rPr>
+                <m:t>H</m:t>
+              </m:r>
+            </m:e>
+            <m:sub>
+              <m:r>
+                <m:t>2</m:t>
+              </m:r>
+            </m:sub>
+          </m:sSub>
+          <m:r>
+            <m:rPr>
+              <m:nor/>
+              <m:sty m:val="p"/>
+            </m:rPr>
+            <m:t>O</m:t>
+          </m:r>
+        </m:oMath>
+      </m:oMathPara>
+    </w:p>
+    <w:p>
+      <w:pPr>
+        <w:pStyle w:val="FirstParagraph"/>
+      </w:pPr>
+      <m:oMathPara>
+        <m:oMathParaPr>
+          <m:jc m:val="center"/>
+        </m:oMathParaPr>
+        <m:oMath>
+          <m:r>
+            <m:rPr>
+              <m:sty m:val="p"/>
+            </m:rPr>
+            <m:t>[</m:t>
+          </m:r>
+          <m:sSub>
+            <m:e>
+              <m:r>
+                <m:rPr>
+                  <m:nor/>
+                  <m:sty m:val="p"/>
+                </m:rPr>
+                <m:t>H</m:t>
+              </m:r>
+            </m:e>
+            <m:sub>
+              <m:r>
+                <m:t>2</m:t>
+              </m:r>
+            </m:sub>
+          </m:sSub>
+          <m:r>
+            <m:rPr>
+              <m:nor/>
+              <m:sty m:val="p"/>
+            </m:rPr>
+            <m:t>P</m:t>
+          </m:r>
+          <m:r>
+            <m:rPr>
+              <m:sty m:val="p"/>
+            </m:rPr>
+            <m:t>(</m:t>
+          </m:r>
+          <m:sSub>
+            <m:e>
+              <m:r>
+                <m:rPr>
+                  <m:nor/>
+                  <m:sty m:val="p"/>
+                </m:rPr>
+                <m:t>Mo</m:t>
+              </m:r>
+            </m:e>
+            <m:sub>
+              <m:r>
+                <m:t>12</m:t>
+              </m:r>
+            </m:sub>
+          </m:sSub>
+          <m:sSub>
+            <m:e>
+              <m:r>
+                <m:rPr>
+                  <m:nor/>
+                  <m:sty m:val="p"/>
+                </m:rPr>
+                <m:t>O</m:t>
+              </m:r>
+            </m:e>
+            <m:sub>
+              <m:r>
+                <m:t>40</m:t>
+              </m:r>
+            </m:sub>
+          </m:sSub>
+          <m:r>
+            <m:rPr>
+              <m:sty m:val="p"/>
+            </m:rPr>
+            <m:t>)</m:t>
+          </m:r>
+          <m:sSup>
+            <m:e>
+              <m:r>
+                <m:rPr>
+                  <m:sty m:val="p"/>
+                </m:rPr>
+                <m:t>]</m:t>
+              </m:r>
+            </m:e>
+            <m:sup>
+              <m:r>
+                <m:rPr>
+                  <m:sty m:val="p"/>
+                </m:rPr>
+                <m:t>−</m:t>
+              </m:r>
+            </m:sup>
+          </m:sSup>
+          <m:r>
+            <m:rPr>
+              <m:sty m:val="p"/>
+            </m:rPr>
+            <m:t>+</m:t>
+          </m:r>
+          <m:r>
+            <m:rPr>
+              <m:nor/>
+              <m:sty m:val="p"/>
+            </m:rPr>
+            <m:t>Ascorbic Acid</m:t>
+          </m:r>
+          <m:r>
+            <m:rPr>
+              <m:sty m:val="p"/>
+            </m:rPr>
+            <m:t>→</m:t>
+          </m:r>
+          <m:r>
+            <m:rPr>
+              <m:nor/>
+              <m:sty m:val="p"/>
+            </m:rPr>
+            <m:t>Molybdenum Blue Complex</m:t>
+          </m:r>
+        </m:oMath>
+      </m:oMathPara>
+    </w:p>
+    <w:p>
+      <w:pPr>
+        <w:numPr>
+          <w:ilvl w:val="0"/>
+          <w:numId w:val="1000"/>
+        </w:numPr>
+      </w:pPr>
+      <w:r>
+        <w:t xml:space="preserve">เฉดสีของสารละลายจะเปลี่ยนจากสีเหลืองใสอมเขียวจางในระดับต่ำมาก สู่สีฟ้าสว่างในระดับปานกลาง และสีน้ำเงินเข้มมิดไนท์บลูในระดับสูงมาก</w:t>
+      </w:r>
+    </w:p>
+    <w:p>
+      <w:pPr>
+        <w:numPr>
+          <w:ilvl w:val="0"/>
+          <w:numId w:val="1004"/>
+        </w:numPr>
+      </w:pPr>
+      <w:r>
+        <w:rPr>
+          <w:b/>
+          <w:bCs/>
+        </w:rPr>
+        <w:t xml:space="preserve">โพแทสเซียมที่แลกเปลี่ยนได้ (Exchangeable Potassium)</w:t>
+      </w:r>
+      <w:r>
+        <w:t xml:space="preserve"> </w:t>
+      </w:r>
+      <w:r>
+        <w:t xml:space="preserve">อาศัยปฏิกิริยาการตกตะกอนด้วยโซเดียมเตตระฟีนิลโบรอน (Sodium Tetraphenylboron Method) หรือโซเดียมโคบอลตินิไตรต์ (Sodium Cobaltinitrite Method) โดยโพแทสเซียมไอออน (</w:t>
+      </w:r>
+      <m:oMath>
+        <m:sSup>
+          <m:e>
+            <m:r>
+              <m:rPr>
+                <m:nor/>
+                <m:sty m:val="p"/>
+              </m:rPr>
+              <m:t>K</m:t>
+            </m:r>
+          </m:e>
+          <m:sup>
+            <m:r>
+              <m:rPr>
+                <m:sty m:val="p"/>
+              </m:rPr>
+              <m:t>+</m:t>
+            </m:r>
+          </m:sup>
+        </m:sSup>
+      </m:oMath>
+      <w:r>
+        <w:t xml:space="preserve">) ทำปฏิกิริยากับไอออนเตตระฟีนิลโบรอนเกิดเป็นตะกอนสีขาวขุ่น หรือทำปฏิกิริยากับโคบอลตินิไตรต์เกิดเป็นสารแขวนลอยสีส้มอำพันขุ่นทึบแสง ดังสมการเคมี</w:t>
+      </w:r>
+    </w:p>
+    <w:p>
+      <w:pPr>
+        <w:pStyle w:val="BodyText"/>
+      </w:pPr>
+      <m:oMathPara>
+        <m:oMathParaPr>
+          <m:jc m:val="center"/>
+        </m:oMathParaPr>
+        <m:oMath>
+          <m:sSup>
+            <m:e>
+              <m:r>
+                <m:rPr>
+                  <m:nor/>
+                  <m:sty m:val="p"/>
+                </m:rPr>
+                <m:t>K</m:t>
+              </m:r>
+            </m:e>
+            <m:sup>
+              <m:r>
+                <m:rPr>
+                  <m:sty m:val="p"/>
+                </m:rPr>
+                <m:t>+</m:t>
+              </m:r>
+            </m:sup>
+          </m:sSup>
+          <m:r>
+            <m:rPr>
+              <m:sty m:val="p"/>
+            </m:rPr>
+            <m:t>+</m:t>
+          </m:r>
+          <m:r>
+            <m:rPr>
+              <m:sty m:val="p"/>
+            </m:rPr>
+            <m:t>[</m:t>
+          </m:r>
+          <m:r>
+            <m:rPr>
+              <m:nor/>
+              <m:sty m:val="p"/>
+            </m:rPr>
+            <m:t>B</m:t>
+          </m:r>
+          <m:r>
+            <m:rPr>
+              <m:sty m:val="p"/>
+            </m:rPr>
+            <m:t>(</m:t>
+          </m:r>
+          <m:sSub>
+            <m:e>
+              <m:r>
+                <m:rPr>
+                  <m:nor/>
+                  <m:sty m:val="p"/>
+                </m:rPr>
+                <m:t>C</m:t>
+              </m:r>
+            </m:e>
+            <m:sub>
+              <m:r>
+                <m:t>6</m:t>
+              </m:r>
+            </m:sub>
+          </m:sSub>
+          <m:sSub>
+            <m:e>
+              <m:r>
+                <m:rPr>
+                  <m:nor/>
+                  <m:sty m:val="p"/>
+                </m:rPr>
+                <m:t>H</m:t>
+              </m:r>
+            </m:e>
+            <m:sub>
+              <m:r>
+                <m:t>5</m:t>
+              </m:r>
+            </m:sub>
+          </m:sSub>
+          <m:sSub>
+            <m:e>
+              <m:r>
+                <m:rPr>
+                  <m:sty m:val="p"/>
+                </m:rPr>
+                <m:t>)</m:t>
+              </m:r>
+            </m:e>
+            <m:sub>
+              <m:r>
+                <m:t>4</m:t>
+              </m:r>
+            </m:sub>
+          </m:sSub>
+          <m:sSup>
+            <m:e>
+              <m:r>
+                <m:rPr>
+                  <m:sty m:val="p"/>
+                </m:rPr>
+                <m:t>]</m:t>
+              </m:r>
+            </m:e>
+            <m:sup>
+              <m:r>
+                <m:rPr>
+                  <m:sty m:val="p"/>
+                </m:rPr>
+                <m:t>−</m:t>
+              </m:r>
+            </m:sup>
+          </m:sSup>
+          <m:r>
+            <m:rPr>
+              <m:sty m:val="p"/>
+            </m:rPr>
+            <m:t>→</m:t>
+          </m:r>
+          <m:r>
+            <m:rPr>
+              <m:nor/>
+              <m:sty m:val="p"/>
+            </m:rPr>
+            <m:t>KB</m:t>
+          </m:r>
+          <m:r>
+            <m:rPr>
+              <m:sty m:val="p"/>
+            </m:rPr>
+            <m:t>(</m:t>
+          </m:r>
+          <m:sSub>
+            <m:e>
+              <m:r>
+                <m:rPr>
+                  <m:nor/>
+                  <m:sty m:val="p"/>
+                </m:rPr>
+                <m:t>C</m:t>
+              </m:r>
+            </m:e>
+            <m:sub>
+              <m:r>
+                <m:t>6</m:t>
+              </m:r>
+            </m:sub>
+          </m:sSub>
+          <m:sSub>
+            <m:e>
+              <m:r>
+                <m:rPr>
+                  <m:nor/>
+                  <m:sty m:val="p"/>
+                </m:rPr>
+                <m:t>H</m:t>
+              </m:r>
+            </m:e>
+            <m:sub>
+              <m:r>
+                <m:t>5</m:t>
+              </m:r>
+            </m:sub>
+          </m:sSub>
+          <m:sSub>
+            <m:e>
+              <m:r>
+                <m:rPr>
+                  <m:sty m:val="p"/>
+                </m:rPr>
+                <m:t>)</m:t>
+              </m:r>
+            </m:e>
+            <m:sub>
+              <m:r>
+                <m:t>4</m:t>
+              </m:r>
+            </m:sub>
+          </m:sSub>
+          <m:r>
+            <m:rPr>
+              <m:sty m:val="p"/>
+            </m:rPr>
+            <m:t>↓</m:t>
+          </m:r>
+        </m:oMath>
+      </m:oMathPara>
+    </w:p>
+    <w:p>
+      <w:pPr>
+        <w:pStyle w:val="FirstParagraph"/>
+      </w:pPr>
+      <m:oMathPara>
+        <m:oMathParaPr>
+          <m:jc m:val="center"/>
+        </m:oMathParaPr>
+        <m:oMath>
+          <m:r>
+            <m:t>2</m:t>
+          </m:r>
+          <m:sSup>
+            <m:e>
+              <m:r>
+                <m:rPr>
+                  <m:nor/>
+                  <m:sty m:val="p"/>
+                </m:rPr>
+                <m:t>K</m:t>
+              </m:r>
+            </m:e>
+            <m:sup>
+              <m:r>
+                <m:rPr>
+                  <m:sty m:val="p"/>
+                </m:rPr>
+                <m:t>+</m:t>
+              </m:r>
+            </m:sup>
+          </m:sSup>
+          <m:r>
+            <m:rPr>
+              <m:sty m:val="p"/>
+            </m:rPr>
+            <m:t>+</m:t>
+          </m:r>
+          <m:sSup>
+            <m:e>
+              <m:r>
+                <m:rPr>
+                  <m:nor/>
+                  <m:sty m:val="p"/>
+                </m:rPr>
+                <m:t>Na</m:t>
+              </m:r>
+            </m:e>
+            <m:sup>
+              <m:r>
+                <m:rPr>
+                  <m:sty m:val="p"/>
+                </m:rPr>
+                <m:t>+</m:t>
+              </m:r>
+            </m:sup>
+          </m:sSup>
+          <m:r>
+            <m:rPr>
+              <m:sty m:val="p"/>
+            </m:rPr>
+            <m:t>+</m:t>
+          </m:r>
+          <m:r>
+            <m:rPr>
+              <m:sty m:val="p"/>
+            </m:rPr>
+            <m:t>[</m:t>
+          </m:r>
+          <m:r>
+            <m:rPr>
+              <m:nor/>
+              <m:sty m:val="p"/>
+            </m:rPr>
+            <m:t>Co</m:t>
+          </m:r>
+          <m:r>
+            <m:rPr>
+              <m:sty m:val="p"/>
+            </m:rPr>
+            <m:t>(</m:t>
+          </m:r>
+          <m:sSub>
+            <m:e>
+              <m:r>
+                <m:rPr>
+                  <m:nor/>
+                  <m:sty m:val="p"/>
+                </m:rPr>
+                <m:t>NO</m:t>
+              </m:r>
+            </m:e>
+            <m:sub>
+              <m:r>
+                <m:t>2</m:t>
+              </m:r>
+            </m:sub>
+          </m:sSub>
+          <m:sSub>
+            <m:e>
+              <m:r>
+                <m:rPr>
+                  <m:sty m:val="p"/>
+                </m:rPr>
+                <m:t>)</m:t>
+              </m:r>
+            </m:e>
+            <m:sub>
+              <m:r>
+                <m:t>6</m:t>
+              </m:r>
+            </m:sub>
+          </m:sSub>
+          <m:sSup>
+            <m:e>
+              <m:r>
+                <m:rPr>
+                  <m:sty m:val="p"/>
+                </m:rPr>
+                <m:t>]</m:t>
+              </m:r>
+            </m:e>
+            <m:sup>
+              <m:r>
+                <m:t>3</m:t>
+              </m:r>
+              <m:r>
+                <m:rPr>
+                  <m:sty m:val="p"/>
+                </m:rPr>
+                <m:t>−</m:t>
+              </m:r>
+            </m:sup>
+          </m:sSup>
+          <m:r>
+            <m:rPr>
+              <m:sty m:val="p"/>
+            </m:rPr>
+            <m:t>→</m:t>
+          </m:r>
+          <m:sSub>
+            <m:e>
+              <m:r>
+                <m:rPr>
+                  <m:nor/>
+                  <m:sty m:val="p"/>
+                </m:rPr>
+                <m:t>K</m:t>
+              </m:r>
+            </m:e>
+            <m:sub>
+              <m:r>
+                <m:t>2</m:t>
+              </m:r>
+            </m:sub>
+          </m:sSub>
+          <m:r>
+            <m:rPr>
+              <m:nor/>
+              <m:sty m:val="p"/>
+            </m:rPr>
+            <m:t>Na</m:t>
+          </m:r>
+          <m:r>
+            <m:rPr>
+              <m:sty m:val="p"/>
+            </m:rPr>
+            <m:t>[</m:t>
+          </m:r>
+          <m:r>
+            <m:rPr>
+              <m:nor/>
+              <m:sty m:val="p"/>
+            </m:rPr>
+            <m:t>Co</m:t>
+          </m:r>
+          <m:r>
+            <m:rPr>
+              <m:sty m:val="p"/>
+            </m:rPr>
+            <m:t>(</m:t>
+          </m:r>
+          <m:sSub>
+            <m:e>
+              <m:r>
+                <m:rPr>
+                  <m:nor/>
+                  <m:sty m:val="p"/>
+                </m:rPr>
+                <m:t>NO</m:t>
+              </m:r>
+            </m:e>
+            <m:sub>
+              <m:r>
+                <m:t>2</m:t>
+              </m:r>
+            </m:sub>
+          </m:sSub>
+          <m:sSub>
+            <m:e>
+              <m:r>
+                <m:rPr>
+                  <m:sty m:val="p"/>
+                </m:rPr>
+                <m:t>)</m:t>
+              </m:r>
+            </m:e>
+            <m:sub>
+              <m:r>
+                <m:t>6</m:t>
+              </m:r>
+            </m:sub>
+          </m:sSub>
+          <m:r>
+            <m:rPr>
+              <m:sty m:val="p"/>
+            </m:rPr>
+            <m:t>]</m:t>
+          </m:r>
+          <m:r>
+            <m:rPr>
+              <m:sty m:val="p"/>
+            </m:rPr>
+            <m:t>↓</m:t>
+          </m:r>
+        </m:oMath>
+      </m:oMathPara>
+    </w:p>
+    <w:p>
+      <w:pPr>
+        <w:numPr>
+          <w:ilvl w:val="0"/>
+          <w:numId w:val="1000"/>
+        </w:numPr>
+      </w:pPr>
+      <w:r>
+        <w:t xml:space="preserve">ระดับความขุ่นและการบดบังแสงจะเพิ่มขึ้นตามความเข้มข้นของโพแทสเซียมในดิน</w:t>
+      </w:r>
+    </w:p>
+    <w:bookmarkEnd w:id="32"/>
+    <w:bookmarkStart w:id="33" w:name="X42b76fe11f954b5245a11f94b83a099135e6239"/>
+    <w:p>
+      <w:pPr>
+        <w:pStyle w:val="Heading3"/>
+      </w:pPr>
+      <w:r>
+        <w:t xml:space="preserve">2.7.3 ตารางเปรียบเทียบเกณฑ์มาตรฐานระดับคุณภาพและช่วงความเข้มข้นเชิงปริมาณ</w:t>
+      </w:r>
+    </w:p>
+    <w:p>
+      <w:pPr>
+        <w:pStyle w:val="FirstParagraph"/>
+      </w:pPr>
+      <w:r>
+        <w:t xml:space="preserve">การแปลงผลการประเมินเชิงคุณภาพจากแถบสีเทียบมาตรฐานสู่ค่าเชิงปริมาณที่มีหน่วยวิศวกรรมสากล อาศัยเกณฑ์มาตรฐานของกรมพัฒนาที่ดิน (LDD Thailand) และมาตรฐานสากล SSSA ดังแสดงในตารางที่ 2.3</w:t>
+      </w:r>
+    </w:p>
+    <w:p>
+      <w:pPr>
+        <w:pStyle w:val="BodyText"/>
+      </w:pPr>
+      <w:r>
+        <w:rPr>
+          <w:b/>
+          <w:bCs/>
+        </w:rPr>
+        <w:t xml:space="preserve">ตารางที่ 2.3 เกณฑ์มาตรฐานแถบสีเทียบเคียงและช่วงความเข้มข้นเชิงปริมาณของธาตุอาหารในดิน NPK และ pH</w:t>
+      </w:r>
+    </w:p>
+    <w:tbl>
+      <w:tblPr>
+        <w:tblStyle w:val="Table"/>
+        <w:tblW w:type="pct" w:w="5000"/>
+        <w:tblLayout w:type="fixed"/>
+        <w:tblLook w:firstRow="1" w:lastRow="0" w:firstColumn="0" w:lastColumn="0" w:noHBand="0" w:noVBand="0" w:val="0020"/>
+      </w:tblPr>
+      <w:tblGrid>
+        <w:gridCol w:w="1218"/>
+        <w:gridCol w:w="1218"/>
+        <w:gridCol w:w="1523"/>
+        <w:gridCol w:w="1218"/>
+        <w:gridCol w:w="1218"/>
+        <w:gridCol w:w="1523"/>
+      </w:tblGrid>
+      <w:tr>
+        <w:trPr>
+          <w:tblHeader w:val="on"/>
+        </w:trPr>
+        <w:tc>
+          <w:tcPr/>
+          <w:p>
+            <w:pPr>
+              <w:pStyle w:val="Compact"/>
+              <w:jc w:val="left"/>
+            </w:pPr>
+            <w:r>
+              <w:t xml:space="preserve">พารามิเตอร์</w:t>
+            </w:r>
+          </w:p>
+        </w:tc>
+        <w:tc>
+          <w:tcPr/>
+          <w:p>
+            <w:pPr>
+              <w:pStyle w:val="Compact"/>
+              <w:jc w:val="left"/>
+            </w:pPr>
+            <w:r>
+              <w:t xml:space="preserve">ระดับคุณภาพดิน (Tier)</w:t>
+            </w:r>
+          </w:p>
+        </w:tc>
+        <w:tc>
+          <w:tcPr/>
+          <w:p>
+            <w:pPr>
+              <w:pStyle w:val="Compact"/>
+              <w:jc w:val="center"/>
+            </w:pPr>
+            <w:r>
+              <w:t xml:space="preserve">ช่วงค่าเชิงปริมาณ</w:t>
+            </w:r>
+          </w:p>
+        </w:tc>
+        <w:tc>
+          <w:tcPr/>
+          <w:p>
+            <w:pPr>
+              <w:pStyle w:val="Compact"/>
+              <w:jc w:val="left"/>
+            </w:pPr>
+            <w:r>
+              <w:t xml:space="preserve">มาตรฐานอ้างอิง</w:t>
+            </w:r>
+          </w:p>
+        </w:tc>
+        <w:tc>
+          <w:tcPr/>
+          <w:p>
+            <w:pPr>
+              <w:pStyle w:val="Compact"/>
+              <w:jc w:val="left"/>
+            </w:pPr>
+            <w:r>
+              <w:t xml:space="preserve">เฉดสีทางเคมีวิเคราะห์</w:t>
+            </w:r>
+          </w:p>
+        </w:tc>
+        <w:tc>
+          <w:tcPr/>
+          <w:p>
+            <w:pPr>
+              <w:pStyle w:val="Compact"/>
+              <w:jc w:val="center"/>
+            </w:pPr>
+            <w:r>
+              <w:t xml:space="preserve">รหัสสีดิจิทัล (HEX)</w:t>
+            </w:r>
+          </w:p>
+        </w:tc>
+      </w:tr>
+      <w:tr>
+        <w:tc>
+          <w:tcPr/>
+          <w:p>
+            <w:pPr>
+              <w:pStyle w:val="Compact"/>
+              <w:jc w:val="left"/>
+            </w:pPr>
+            <w:r>
+              <w:rPr>
+                <w:b/>
+                <w:bCs/>
+              </w:rPr>
+              <w:t xml:space="preserve">ความเป็นกรด-ด่าง</w:t>
+            </w:r>
+          </w:p>
+        </w:tc>
+        <w:tc>
+          <w:tcPr/>
+          <w:p>
+            <w:pPr>
+              <w:pStyle w:val="Compact"/>
+              <w:jc w:val="left"/>
+            </w:pPr>
+            <w:r>
+              <w:t xml:space="preserve">กรดจัดรุนแรง (Extremely Acid)</w:t>
+            </w:r>
+          </w:p>
+        </w:tc>
+        <w:tc>
+          <w:tcPr/>
+          <w:p>
+            <w:pPr>
+              <w:pStyle w:val="Compact"/>
+              <w:jc w:val="center"/>
+            </w:pPr>
+            <m:oMath>
+              <m:r>
+                <m:rPr>
+                  <m:sty m:val="p"/>
+                </m:rPr>
+                <m:t>&lt;</m:t>
+              </m:r>
+              <m:r>
+                <m:t>4.5</m:t>
+              </m:r>
+              <m:r>
+                <m:rPr>
+                  <m:nor/>
+                  <m:sty m:val="p"/>
+                </m:rPr>
+                <m:t> pH</m:t>
+              </m:r>
+            </m:oMath>
+            <w:r>
+              <w:t xml:space="preserve">​</w:t>
+            </w:r>
+          </w:p>
+        </w:tc>
+        <w:tc>
+          <w:tcPr/>
+          <w:p>
+            <w:pPr>
+              <w:pStyle w:val="Compact"/>
+              <w:jc w:val="left"/>
+            </w:pPr>
+            <w:r>
+              <w:t xml:space="preserve">LDD / USDA</w:t>
+            </w:r>
+          </w:p>
+        </w:tc>
+        <w:tc>
+          <w:tcPr/>
+          <w:p>
+            <w:pPr>
+              <w:pStyle w:val="Compact"/>
+              <w:jc w:val="left"/>
+            </w:pPr>
+            <w:r>
+              <w:t xml:space="preserve">แดงส้มสดใส (Red-Orange)</w:t>
+            </w:r>
+          </w:p>
+        </w:tc>
+        <w:tc>
+          <w:tcPr/>
+          <w:p>
+            <w:pPr>
+              <w:pStyle w:val="Compact"/>
+              <w:jc w:val="center"/>
+            </w:pPr>
+            <w:r>
+              <w:rPr>
+                <w:rStyle w:val="VerbatimChar"/>
+              </w:rPr>
+              <w:t xml:space="preserve">#e63946</w:t>
+            </w:r>
+          </w:p>
+        </w:tc>
+      </w:tr>
+      <w:tr>
+        <w:tc>
+          <w:tcPr/>
+          <w:p>
+            <w:pPr>
+              <w:pStyle w:val="Compact"/>
+              <w:jc w:val="left"/>
+            </w:pPr>
+            <w:r>
+              <w:t xml:space="preserve">(Soil pH)</w:t>
+            </w:r>
+          </w:p>
+        </w:tc>
+        <w:tc>
+          <w:tcPr/>
+          <w:p>
+            <w:pPr>
+              <w:pStyle w:val="Compact"/>
+              <w:jc w:val="left"/>
+            </w:pPr>
+            <w:r>
+              <w:t xml:space="preserve">กรดจัด (Very Strongly Acid)</w:t>
+            </w:r>
+          </w:p>
+        </w:tc>
+        <w:tc>
+          <w:tcPr/>
+          <w:p>
+            <w:pPr>
+              <w:pStyle w:val="Compact"/>
+              <w:jc w:val="center"/>
+            </w:pPr>
+            <m:oMath>
+              <m:r>
+                <m:t>4.5</m:t>
+              </m:r>
+              <m:r>
+                <m:rPr>
+                  <m:sty m:val="p"/>
+                </m:rPr>
+                <m:t>−</m:t>
+              </m:r>
+              <m:r>
+                <m:t>5.2</m:t>
+              </m:r>
+              <m:r>
+                <m:rPr>
+                  <m:nor/>
+                  <m:sty m:val="p"/>
+                </m:rPr>
+                <m:t> pH</m:t>
+              </m:r>
+            </m:oMath>
+            <w:r>
+              <w:t xml:space="preserve">​</w:t>
+            </w:r>
+          </w:p>
+        </w:tc>
+        <w:tc>
+          <w:tcPr/>
+          <w:p>
+            <w:pPr>
+              <w:pStyle w:val="Compact"/>
+              <w:jc w:val="left"/>
+            </w:pPr>
+            <w:r>
+              <w:t xml:space="preserve">LDD / USDA</w:t>
+            </w:r>
+          </w:p>
+        </w:tc>
+        <w:tc>
+          <w:tcPr/>
+          <w:p>
+            <w:pPr>
+              <w:pStyle w:val="Compact"/>
+              <w:jc w:val="left"/>
+            </w:pPr>
+            <w:r>
+              <w:t xml:space="preserve">ส้มอมเหลือง (Orange-Amber)</w:t>
+            </w:r>
+          </w:p>
+        </w:tc>
+        <w:tc>
+          <w:tcPr/>
+          <w:p>
+            <w:pPr>
+              <w:pStyle w:val="Compact"/>
+              <w:jc w:val="center"/>
+            </w:pPr>
+            <w:r>
+              <w:rPr>
+                <w:rStyle w:val="VerbatimChar"/>
+              </w:rPr>
+              <w:t xml:space="preserve">#f4a261</w:t>
+            </w:r>
+          </w:p>
+        </w:tc>
+      </w:tr>
+      <w:tr>
+        <w:tc>
+          <w:tcPr/>
+          <w:p>
+            <w:pPr>
+              <w:pStyle w:val="Compact"/>
+            </w:pPr>
+          </w:p>
+        </w:tc>
+        <w:tc>
+          <w:tcPr/>
+          <w:p>
+            <w:pPr>
+              <w:pStyle w:val="Compact"/>
+              <w:jc w:val="left"/>
+            </w:pPr>
+            <w:r>
+              <w:t xml:space="preserve">กรดปานกลาง (Moderately Acid)</w:t>
+            </w:r>
+          </w:p>
+        </w:tc>
+        <w:tc>
+          <w:tcPr/>
+          <w:p>
+            <w:pPr>
+              <w:pStyle w:val="Compact"/>
+              <w:jc w:val="center"/>
+            </w:pPr>
+            <m:oMath>
+              <m:r>
+                <m:t>5.3</m:t>
+              </m:r>
+              <m:r>
+                <m:rPr>
+                  <m:sty m:val="p"/>
+                </m:rPr>
+                <m:t>−</m:t>
+              </m:r>
+              <m:r>
+                <m:t>6.0</m:t>
+              </m:r>
+              <m:r>
+                <m:rPr>
+                  <m:nor/>
+                  <m:sty m:val="p"/>
+                </m:rPr>
+                <m:t> pH</m:t>
+              </m:r>
+            </m:oMath>
+            <w:r>
+              <w:t xml:space="preserve">​</w:t>
+            </w:r>
+          </w:p>
+        </w:tc>
+        <w:tc>
+          <w:tcPr/>
+          <w:p>
+            <w:pPr>
+              <w:pStyle w:val="Compact"/>
+              <w:jc w:val="left"/>
+            </w:pPr>
+            <w:r>
+              <w:t xml:space="preserve">LDD / USDA</w:t>
+            </w:r>
+          </w:p>
+        </w:tc>
+        <w:tc>
+          <w:tcPr/>
+          <w:p>
+            <w:pPr>
+              <w:pStyle w:val="Compact"/>
+              <w:jc w:val="left"/>
+            </w:pPr>
+            <w:r>
+              <w:t xml:space="preserve">เหลืองอมเขียว (Yellow-Green)</w:t>
+            </w:r>
+          </w:p>
+        </w:tc>
+        <w:tc>
+          <w:tcPr/>
+          <w:p>
+            <w:pPr>
+              <w:pStyle w:val="Compact"/>
+              <w:jc w:val="center"/>
+            </w:pPr>
+            <w:r>
+              <w:rPr>
+                <w:rStyle w:val="VerbatimChar"/>
+              </w:rPr>
+              <w:t xml:space="preserve">#e9c46a</w:t>
+            </w:r>
+          </w:p>
+        </w:tc>
+      </w:tr>
+      <w:tr>
+        <w:tc>
+          <w:tcPr/>
+          <w:p>
+            <w:pPr>
+              <w:pStyle w:val="Compact"/>
+            </w:pPr>
+          </w:p>
+        </w:tc>
+        <w:tc>
+          <w:tcPr/>
+          <w:p>
+            <w:pPr>
+              <w:pStyle w:val="Compact"/>
+              <w:jc w:val="left"/>
+            </w:pPr>
+            <w:r>
+              <w:t xml:space="preserve">เป็นกรดเล็กน้อย (Slightly Acid)</w:t>
+            </w:r>
+          </w:p>
+        </w:tc>
+        <w:tc>
+          <w:tcPr/>
+          <w:p>
+            <w:pPr>
+              <w:pStyle w:val="Compact"/>
+              <w:jc w:val="center"/>
+            </w:pPr>
+            <m:oMath>
+              <m:r>
+                <m:t>6.1</m:t>
+              </m:r>
+              <m:r>
+                <m:rPr>
+                  <m:sty m:val="p"/>
+                </m:rPr>
+                <m:t>−</m:t>
+              </m:r>
+              <m:r>
+                <m:t>6.8</m:t>
+              </m:r>
+              <m:r>
+                <m:rPr>
+                  <m:nor/>
+                  <m:sty m:val="p"/>
+                </m:rPr>
+                <m:t> pH</m:t>
+              </m:r>
+            </m:oMath>
+            <w:r>
+              <w:t xml:space="preserve">​</w:t>
+            </w:r>
+          </w:p>
+        </w:tc>
+        <w:tc>
+          <w:tcPr/>
+          <w:p>
+            <w:pPr>
+              <w:pStyle w:val="Compact"/>
+              <w:jc w:val="left"/>
+            </w:pPr>
+            <w:r>
+              <w:t xml:space="preserve">LDD / USDA</w:t>
+            </w:r>
+          </w:p>
+        </w:tc>
+        <w:tc>
+          <w:tcPr/>
+          <w:p>
+            <w:pPr>
+              <w:pStyle w:val="Compact"/>
+              <w:jc w:val="left"/>
+            </w:pPr>
+            <w:r>
+              <w:t xml:space="preserve">เขียวมะนาวอ่อน (Light Lime)</w:t>
+            </w:r>
+          </w:p>
+        </w:tc>
+        <w:tc>
+          <w:tcPr/>
+          <w:p>
+            <w:pPr>
+              <w:pStyle w:val="Compact"/>
+              <w:jc w:val="center"/>
+            </w:pPr>
+            <w:r>
+              <w:rPr>
+                <w:rStyle w:val="VerbatimChar"/>
+              </w:rPr>
+              <w:t xml:space="preserve">#a7c957</w:t>
+            </w:r>
+          </w:p>
+        </w:tc>
+      </w:tr>
+      <w:tr>
+        <w:tc>
+          <w:tcPr/>
+          <w:p>
+            <w:pPr>
+              <w:pStyle w:val="Compact"/>
+            </w:pPr>
+          </w:p>
+        </w:tc>
+        <w:tc>
+          <w:tcPr/>
+          <w:p>
+            <w:pPr>
+              <w:pStyle w:val="Compact"/>
+              <w:jc w:val="left"/>
+            </w:pPr>
+            <w:r>
+              <w:t xml:space="preserve">เป็นกลาง (Neutral - เหมาะสม)</w:t>
+            </w:r>
+          </w:p>
+        </w:tc>
+        <w:tc>
+          <w:tcPr/>
+          <w:p>
+            <w:pPr>
+              <w:pStyle w:val="Compact"/>
+              <w:jc w:val="center"/>
+            </w:pPr>
+            <m:oMath>
+              <m:r>
+                <m:t>6.9</m:t>
+              </m:r>
+              <m:r>
+                <m:rPr>
+                  <m:sty m:val="p"/>
+                </m:rPr>
+                <m:t>−</m:t>
+              </m:r>
+              <m:r>
+                <m:t>7.5</m:t>
+              </m:r>
+              <m:r>
+                <m:rPr>
+                  <m:nor/>
+                  <m:sty m:val="p"/>
+                </m:rPr>
+                <m:t> pH</m:t>
+              </m:r>
+            </m:oMath>
+            <w:r>
+              <w:t xml:space="preserve">​</w:t>
+            </w:r>
+          </w:p>
+        </w:tc>
+        <w:tc>
+          <w:tcPr/>
+          <w:p>
+            <w:pPr>
+              <w:pStyle w:val="Compact"/>
+              <w:jc w:val="left"/>
+            </w:pPr>
+            <w:r>
+              <w:t xml:space="preserve">LDD / USDA</w:t>
+            </w:r>
+          </w:p>
+        </w:tc>
+        <w:tc>
+          <w:tcPr/>
+          <w:p>
+            <w:pPr>
+              <w:pStyle w:val="Compact"/>
+              <w:jc w:val="left"/>
+            </w:pPr>
+            <w:r>
+              <w:t xml:space="preserve">เขียวมรกตธรรมชาติ (Emerald)</w:t>
+            </w:r>
+          </w:p>
+        </w:tc>
+        <w:tc>
+          <w:tcPr/>
+          <w:p>
+            <w:pPr>
+              <w:pStyle w:val="Compact"/>
+              <w:jc w:val="center"/>
+            </w:pPr>
+            <w:r>
+              <w:rPr>
+                <w:rStyle w:val="VerbatimChar"/>
+              </w:rPr>
+              <w:t xml:space="preserve">#2a9d8f</w:t>
+            </w:r>
+          </w:p>
+        </w:tc>
+      </w:tr>
+      <w:tr>
+        <w:tc>
+          <w:tcPr/>
+          <w:p>
+            <w:pPr>
+              <w:pStyle w:val="Compact"/>
+            </w:pPr>
+          </w:p>
+        </w:tc>
+        <w:tc>
+          <w:tcPr/>
+          <w:p>
+            <w:pPr>
+              <w:pStyle w:val="Compact"/>
+              <w:jc w:val="left"/>
+            </w:pPr>
+            <w:r>
+              <w:t xml:space="preserve">ด่างปานกลาง (Moderately Alkaline)</w:t>
+            </w:r>
+          </w:p>
+        </w:tc>
+        <w:tc>
+          <w:tcPr/>
+          <w:p>
+            <w:pPr>
+              <w:pStyle w:val="Compact"/>
+              <w:jc w:val="center"/>
+            </w:pPr>
+            <m:oMath>
+              <m:r>
+                <m:t>7.6</m:t>
+              </m:r>
+              <m:r>
+                <m:rPr>
+                  <m:sty m:val="p"/>
+                </m:rPr>
+                <m:t>−</m:t>
+              </m:r>
+              <m:r>
+                <m:t>8.4</m:t>
+              </m:r>
+              <m:r>
+                <m:rPr>
+                  <m:nor/>
+                  <m:sty m:val="p"/>
+                </m:rPr>
+                <m:t> pH</m:t>
+              </m:r>
+            </m:oMath>
+            <w:r>
+              <w:t xml:space="preserve">​</w:t>
+            </w:r>
+          </w:p>
+        </w:tc>
+        <w:tc>
+          <w:tcPr/>
+          <w:p>
+            <w:pPr>
+              <w:pStyle w:val="Compact"/>
+              <w:jc w:val="left"/>
+            </w:pPr>
+            <w:r>
+              <w:t xml:space="preserve">LDD / USDA</w:t>
+            </w:r>
+          </w:p>
+        </w:tc>
+        <w:tc>
+          <w:tcPr/>
+          <w:p>
+            <w:pPr>
+              <w:pStyle w:val="Compact"/>
+              <w:jc w:val="left"/>
+            </w:pPr>
+            <w:r>
+              <w:t xml:space="preserve">ฟ้าครามแกมเขียว (Cyan-Teal)</w:t>
+            </w:r>
+          </w:p>
+        </w:tc>
+        <w:tc>
+          <w:tcPr/>
+          <w:p>
+            <w:pPr>
+              <w:pStyle w:val="Compact"/>
+              <w:jc w:val="center"/>
+            </w:pPr>
+            <w:r>
+              <w:rPr>
+                <w:rStyle w:val="VerbatimChar"/>
+              </w:rPr>
+              <w:t xml:space="preserve">#457b9d</w:t>
+            </w:r>
+          </w:p>
+        </w:tc>
+      </w:tr>
+      <w:tr>
+        <w:tc>
+          <w:tcPr/>
+          <w:p>
+            <w:pPr>
+              <w:pStyle w:val="Compact"/>
+            </w:pPr>
+          </w:p>
+        </w:tc>
+        <w:tc>
+          <w:tcPr/>
+          <w:p>
+            <w:pPr>
+              <w:pStyle w:val="Compact"/>
+              <w:jc w:val="left"/>
+            </w:pPr>
+            <w:r>
+              <w:t xml:space="preserve">ด่างรุนแรง (Strongly Alkaline)</w:t>
+            </w:r>
+          </w:p>
+        </w:tc>
+        <w:tc>
+          <w:tcPr/>
+          <w:p>
+            <w:pPr>
+              <w:pStyle w:val="Compact"/>
+              <w:jc w:val="center"/>
+            </w:pPr>
+            <m:oMath>
+              <m:r>
+                <m:rPr>
+                  <m:sty m:val="p"/>
+                </m:rPr>
+                <m:t>&gt;</m:t>
+              </m:r>
+              <m:r>
+                <m:t>8.4</m:t>
+              </m:r>
+              <m:r>
+                <m:rPr>
+                  <m:nor/>
+                  <m:sty m:val="p"/>
+                </m:rPr>
+                <m:t> pH</m:t>
+              </m:r>
+            </m:oMath>
+            <w:r>
+              <w:t xml:space="preserve">​</w:t>
+            </w:r>
+          </w:p>
+        </w:tc>
+        <w:tc>
+          <w:tcPr/>
+          <w:p>
+            <w:pPr>
+              <w:pStyle w:val="Compact"/>
+              <w:jc w:val="left"/>
+            </w:pPr>
+            <w:r>
+              <w:t xml:space="preserve">LDD / USDA</w:t>
+            </w:r>
+          </w:p>
+        </w:tc>
+        <w:tc>
+          <w:tcPr/>
+          <w:p>
+            <w:pPr>
+              <w:pStyle w:val="Compact"/>
+              <w:jc w:val="left"/>
+            </w:pPr>
+            <w:r>
+              <w:t xml:space="preserve">น้ำเงินม่วงเข้ม (Deep Indigo)</w:t>
+            </w:r>
+          </w:p>
+        </w:tc>
+        <w:tc>
+          <w:tcPr/>
+          <w:p>
+            <w:pPr>
+              <w:pStyle w:val="Compact"/>
+              <w:jc w:val="center"/>
+            </w:pPr>
+            <w:r>
+              <w:rPr>
+                <w:rStyle w:val="VerbatimChar"/>
+              </w:rPr>
+              <w:t xml:space="preserve">#1d3557</w:t>
+            </w:r>
+          </w:p>
+        </w:tc>
+      </w:tr>
+      <w:tr>
+        <w:tc>
+          <w:tcPr/>
+          <w:p>
+            <w:pPr>
+              <w:pStyle w:val="Compact"/>
+              <w:jc w:val="left"/>
+            </w:pPr>
+            <w:r>
+              <w:rPr>
+                <w:b/>
+                <w:bCs/>
+              </w:rPr>
+              <w:t xml:space="preserve">ไนโตรเจนที่ใช้ประโยชน์</w:t>
+            </w:r>
+          </w:p>
+        </w:tc>
+        <w:tc>
+          <w:tcPr/>
+          <w:p>
+            <w:pPr>
+              <w:pStyle w:val="Compact"/>
+              <w:jc w:val="left"/>
+            </w:pPr>
+            <w:r>
+              <w:t xml:space="preserve">ต่ำมาก (Depleted / Very Low)</w:t>
+            </w:r>
+          </w:p>
+        </w:tc>
+        <w:tc>
+          <w:tcPr/>
+          <w:p>
+            <w:pPr>
+              <w:pStyle w:val="Compact"/>
+              <w:jc w:val="center"/>
+            </w:pPr>
+            <m:oMath>
+              <m:r>
+                <m:rPr>
+                  <m:sty m:val="p"/>
+                </m:rPr>
+                <m:t>&lt;</m:t>
+              </m:r>
+              <m:r>
+                <m:t>10</m:t>
+              </m:r>
+              <m:r>
+                <m:rPr>
+                  <m:nor/>
+                  <m:sty m:val="p"/>
+                </m:rPr>
+                <m:t> mg/kg</m:t>
+              </m:r>
+            </m:oMath>
+            <w:r>
+              <w:t xml:space="preserve">​</w:t>
+            </w:r>
+          </w:p>
+        </w:tc>
+        <w:tc>
+          <w:tcPr/>
+          <w:p>
+            <w:pPr>
+              <w:pStyle w:val="Compact"/>
+              <w:jc w:val="left"/>
+            </w:pPr>
+            <w:r>
+              <w:t xml:space="preserve">LDD / LaMotte STH</w:t>
+            </w:r>
+          </w:p>
+        </w:tc>
+        <w:tc>
+          <w:tcPr/>
+          <w:p>
+            <w:pPr>
+              <w:pStyle w:val="Compact"/>
+              <w:jc w:val="left"/>
+            </w:pPr>
+            <w:r>
+              <w:t xml:space="preserve">เหลืองซีดโปร่งใส (Pale Yellow)</w:t>
+            </w:r>
+          </w:p>
+        </w:tc>
+        <w:tc>
+          <w:tcPr/>
+          <w:p>
+            <w:pPr>
+              <w:pStyle w:val="Compact"/>
+              <w:jc w:val="center"/>
+            </w:pPr>
+            <w:r>
+              <w:rPr>
+                <w:rStyle w:val="VerbatimChar"/>
+              </w:rPr>
+              <w:t xml:space="preserve">#fefae0</w:t>
+            </w:r>
+          </w:p>
+        </w:tc>
+      </w:tr>
+      <w:tr>
+        <w:tc>
+          <w:tcPr/>
+          <w:p>
+            <w:pPr>
+              <w:pStyle w:val="Compact"/>
+              <w:jc w:val="left"/>
+            </w:pPr>
+            <w:r>
+              <w:t xml:space="preserve">(</w:t>
+            </w:r>
+            <m:oMath>
+              <m:sSubSup>
+                <m:e>
+                  <m:r>
+                    <m:rPr>
+                      <m:nor/>
+                      <m:sty m:val="p"/>
+                    </m:rPr>
+                    <m:t>NO</m:t>
+                  </m:r>
+                </m:e>
+                <m:sub>
+                  <m:r>
+                    <m:t>3</m:t>
+                  </m:r>
+                </m:sub>
+                <m:sup>
+                  <m:r>
+                    <m:rPr>
+                      <m:sty m:val="p"/>
+                    </m:rPr>
+                    <m:t>−</m:t>
+                  </m:r>
+                </m:sup>
+              </m:sSubSup>
+              <m:r>
+                <m:rPr>
+                  <m:sty m:val="p"/>
+                </m:rPr>
+                <m:t>−</m:t>
+              </m:r>
+              <m:r>
+                <m:rPr>
+                  <m:nor/>
+                  <m:sty m:val="p"/>
+                </m:rPr>
+                <m:t>N</m:t>
+              </m:r>
+            </m:oMath>
+            <w:r>
+              <w:t xml:space="preserve">)</w:t>
+            </w:r>
+          </w:p>
+        </w:tc>
+        <w:tc>
+          <w:tcPr/>
+          <w:p>
+            <w:pPr>
+              <w:pStyle w:val="Compact"/>
+              <w:jc w:val="left"/>
+            </w:pPr>
+            <w:r>
+              <w:t xml:space="preserve">ต่ำ (Deficient / Low)</w:t>
+            </w:r>
+          </w:p>
+        </w:tc>
+        <w:tc>
+          <w:tcPr/>
+          <w:p>
+            <w:pPr>
+              <w:pStyle w:val="Compact"/>
+              <w:jc w:val="center"/>
+            </w:pPr>
+            <m:oMath>
+              <m:r>
+                <m:t>10</m:t>
+              </m:r>
+              <m:r>
+                <m:rPr>
+                  <m:sty m:val="p"/>
+                </m:rPr>
+                <m:t>−</m:t>
+              </m:r>
+              <m:r>
+                <m:t>25</m:t>
+              </m:r>
+              <m:r>
+                <m:rPr>
+                  <m:nor/>
+                  <m:sty m:val="p"/>
+                </m:rPr>
+                <m:t> mg/kg</m:t>
+              </m:r>
+            </m:oMath>
+            <w:r>
+              <w:t xml:space="preserve">​</w:t>
+            </w:r>
+          </w:p>
+        </w:tc>
+        <w:tc>
+          <w:tcPr/>
+          <w:p>
+            <w:pPr>
+              <w:pStyle w:val="Compact"/>
+              <w:jc w:val="left"/>
+            </w:pPr>
+            <w:r>
+              <w:t xml:space="preserve">LDD / LaMotte STH</w:t>
+            </w:r>
+          </w:p>
+        </w:tc>
+        <w:tc>
+          <w:tcPr/>
+          <w:p>
+            <w:pPr>
+              <w:pStyle w:val="Compact"/>
+              <w:jc w:val="left"/>
+            </w:pPr>
+            <w:r>
+              <w:t xml:space="preserve">ชมพูโอลด์โรสอ่อน (Light Coral)</w:t>
+            </w:r>
+          </w:p>
+        </w:tc>
+        <w:tc>
+          <w:tcPr/>
+          <w:p>
+            <w:pPr>
+              <w:pStyle w:val="Compact"/>
+              <w:jc w:val="center"/>
+            </w:pPr>
+            <w:r>
+              <w:rPr>
+                <w:rStyle w:val="VerbatimChar"/>
+              </w:rPr>
+              <w:t xml:space="preserve">#f4a261</w:t>
+            </w:r>
+          </w:p>
+        </w:tc>
+      </w:tr>
+      <w:tr>
+        <w:tc>
+          <w:tcPr/>
+          <w:p>
+            <w:pPr>
+              <w:pStyle w:val="Compact"/>
+            </w:pPr>
+          </w:p>
+        </w:tc>
+        <w:tc>
+          <w:tcPr/>
+          <w:p>
+            <w:pPr>
+              <w:pStyle w:val="Compact"/>
+              <w:jc w:val="left"/>
+            </w:pPr>
+            <w:r>
+              <w:t xml:space="preserve">ปานกลาง (Adequate / Medium)</w:t>
+            </w:r>
+          </w:p>
+        </w:tc>
+        <w:tc>
+          <w:tcPr/>
+          <w:p>
+            <w:pPr>
+              <w:pStyle w:val="Compact"/>
+              <w:jc w:val="center"/>
+            </w:pPr>
+            <m:oMath>
+              <m:r>
+                <m:t>26</m:t>
+              </m:r>
+              <m:r>
+                <m:rPr>
+                  <m:sty m:val="p"/>
+                </m:rPr>
+                <m:t>−</m:t>
+              </m:r>
+              <m:r>
+                <m:t>50</m:t>
+              </m:r>
+              <m:r>
+                <m:rPr>
+                  <m:nor/>
+                  <m:sty m:val="p"/>
+                </m:rPr>
+                <m:t> mg/kg</m:t>
+              </m:r>
+            </m:oMath>
+            <w:r>
+              <w:t xml:space="preserve">​</w:t>
+            </w:r>
+          </w:p>
+        </w:tc>
+        <w:tc>
+          <w:tcPr/>
+          <w:p>
+            <w:pPr>
+              <w:pStyle w:val="Compact"/>
+              <w:jc w:val="left"/>
+            </w:pPr>
+            <w:r>
+              <w:t xml:space="preserve">LDD / LaMotte STH</w:t>
+            </w:r>
+          </w:p>
+        </w:tc>
+        <w:tc>
+          <w:tcPr/>
+          <w:p>
+            <w:pPr>
+              <w:pStyle w:val="Compact"/>
+              <w:jc w:val="left"/>
+            </w:pPr>
+            <w:r>
+              <w:t xml:space="preserve">ชมพูสดใส (Vibrant Pink)</w:t>
+            </w:r>
+          </w:p>
+        </w:tc>
+        <w:tc>
+          <w:tcPr/>
+          <w:p>
+            <w:pPr>
+              <w:pStyle w:val="Compact"/>
+              <w:jc w:val="center"/>
+            </w:pPr>
+            <w:r>
+              <w:rPr>
+                <w:rStyle w:val="VerbatimChar"/>
+              </w:rPr>
+              <w:t xml:space="preserve">#e76f51</w:t>
+            </w:r>
+          </w:p>
+        </w:tc>
+      </w:tr>
+      <w:tr>
+        <w:tc>
+          <w:tcPr/>
+          <w:p>
+            <w:pPr>
+              <w:pStyle w:val="Compact"/>
+            </w:pPr>
+          </w:p>
+        </w:tc>
+        <w:tc>
+          <w:tcPr/>
+          <w:p>
+            <w:pPr>
+              <w:pStyle w:val="Compact"/>
+              <w:jc w:val="left"/>
+            </w:pPr>
+            <w:r>
+              <w:t xml:space="preserve">สูง (Sufficient / High)</w:t>
+            </w:r>
+          </w:p>
+        </w:tc>
+        <w:tc>
+          <w:tcPr/>
+          <w:p>
+            <w:pPr>
+              <w:pStyle w:val="Compact"/>
+              <w:jc w:val="center"/>
+            </w:pPr>
+            <m:oMath>
+              <m:r>
+                <m:t>51</m:t>
+              </m:r>
+              <m:r>
+                <m:rPr>
+                  <m:sty m:val="p"/>
+                </m:rPr>
+                <m:t>−</m:t>
+              </m:r>
+              <m:r>
+                <m:t>80</m:t>
+              </m:r>
+              <m:r>
+                <m:rPr>
+                  <m:nor/>
+                  <m:sty m:val="p"/>
+                </m:rPr>
+                <m:t> mg/kg</m:t>
+              </m:r>
+            </m:oMath>
+            <w:r>
+              <w:t xml:space="preserve">​</w:t>
+            </w:r>
+          </w:p>
+        </w:tc>
+        <w:tc>
+          <w:tcPr/>
+          <w:p>
+            <w:pPr>
+              <w:pStyle w:val="Compact"/>
+              <w:jc w:val="left"/>
+            </w:pPr>
+            <w:r>
+              <w:t xml:space="preserve">LDD / LaMotte STH</w:t>
+            </w:r>
+          </w:p>
+        </w:tc>
+        <w:tc>
+          <w:tcPr/>
+          <w:p>
+            <w:pPr>
+              <w:pStyle w:val="Compact"/>
+              <w:jc w:val="left"/>
+            </w:pPr>
+            <w:r>
+              <w:t xml:space="preserve">แดงกุหลาบสด (Rose Red)</w:t>
+            </w:r>
+          </w:p>
+        </w:tc>
+        <w:tc>
+          <w:tcPr/>
+          <w:p>
+            <w:pPr>
+              <w:pStyle w:val="Compact"/>
+              <w:jc w:val="center"/>
+            </w:pPr>
+            <w:r>
+              <w:rPr>
+                <w:rStyle w:val="VerbatimChar"/>
+              </w:rPr>
+              <w:t xml:space="preserve">#d62828</w:t>
+            </w:r>
+          </w:p>
+        </w:tc>
+      </w:tr>
+      <w:tr>
+        <w:tc>
+          <w:tcPr/>
+          <w:p>
+            <w:pPr>
+              <w:pStyle w:val="Compact"/>
+            </w:pPr>
+          </w:p>
+        </w:tc>
+        <w:tc>
+          <w:tcPr/>
+          <w:p>
+            <w:pPr>
+              <w:pStyle w:val="Compact"/>
+              <w:jc w:val="left"/>
+            </w:pPr>
+            <w:r>
+              <w:t xml:space="preserve">สูงมาก (Surplus / Very High)</w:t>
+            </w:r>
+          </w:p>
+        </w:tc>
+        <w:tc>
+          <w:tcPr/>
+          <w:p>
+            <w:pPr>
+              <w:pStyle w:val="Compact"/>
+              <w:jc w:val="center"/>
+            </w:pPr>
+            <m:oMath>
+              <m:r>
+                <m:rPr>
+                  <m:sty m:val="p"/>
+                </m:rPr>
+                <m:t>&gt;</m:t>
+              </m:r>
+              <m:r>
+                <m:t>80</m:t>
+              </m:r>
+              <m:r>
+                <m:rPr>
+                  <m:nor/>
+                  <m:sty m:val="p"/>
+                </m:rPr>
+                <m:t> mg/kg</m:t>
+              </m:r>
+            </m:oMath>
+            <w:r>
+              <w:t xml:space="preserve">​</w:t>
+            </w:r>
+          </w:p>
+        </w:tc>
+        <w:tc>
+          <w:tcPr/>
+          <w:p>
+            <w:pPr>
+              <w:pStyle w:val="Compact"/>
+              <w:jc w:val="left"/>
+            </w:pPr>
+            <w:r>
+              <w:t xml:space="preserve">LDD / LaMotte STH</w:t>
+            </w:r>
+          </w:p>
+        </w:tc>
+        <w:tc>
+          <w:tcPr/>
+          <w:p>
+            <w:pPr>
+              <w:pStyle w:val="Compact"/>
+              <w:jc w:val="left"/>
+            </w:pPr>
+            <w:r>
+              <w:t xml:space="preserve">ม่วงแดงมาเจนต้าเข้ม (Deep Magenta)</w:t>
+            </w:r>
+          </w:p>
+        </w:tc>
+        <w:tc>
+          <w:tcPr/>
+          <w:p>
+            <w:pPr>
+              <w:pStyle w:val="Compact"/>
+              <w:jc w:val="center"/>
+            </w:pPr>
+            <w:r>
+              <w:rPr>
+                <w:rStyle w:val="VerbatimChar"/>
+              </w:rPr>
+              <w:t xml:space="preserve">#7209b7</w:t>
+            </w:r>
+          </w:p>
+        </w:tc>
+      </w:tr>
+      <w:tr>
+        <w:tc>
+          <w:tcPr/>
+          <w:p>
+            <w:pPr>
+              <w:pStyle w:val="Compact"/>
+              <w:jc w:val="left"/>
+            </w:pPr>
+            <w:r>
+              <w:rPr>
+                <w:b/>
+                <w:bCs/>
+              </w:rPr>
+              <w:t xml:space="preserve">ฟอสฟอรัสที่เป็นประโยชน์</w:t>
+            </w:r>
+          </w:p>
+        </w:tc>
+        <w:tc>
+          <w:tcPr/>
+          <w:p>
+            <w:pPr>
+              <w:pStyle w:val="Compact"/>
+              <w:jc w:val="left"/>
+            </w:pPr>
+            <w:r>
+              <w:t xml:space="preserve">ต่ำมาก (Depleted / Very Low)</w:t>
+            </w:r>
+          </w:p>
+        </w:tc>
+        <w:tc>
+          <w:tcPr/>
+          <w:p>
+            <w:pPr>
+              <w:pStyle w:val="Compact"/>
+              <w:jc w:val="center"/>
+            </w:pPr>
+            <m:oMath>
+              <m:r>
+                <m:rPr>
+                  <m:sty m:val="p"/>
+                </m:rPr>
+                <m:t>&lt;</m:t>
+              </m:r>
+              <m:r>
+                <m:t>5</m:t>
+              </m:r>
+              <m:r>
+                <m:rPr>
+                  <m:nor/>
+                  <m:sty m:val="p"/>
+                </m:rPr>
+                <m:t> mg/kg</m:t>
+              </m:r>
+            </m:oMath>
+            <w:r>
+              <w:t xml:space="preserve">​</w:t>
+            </w:r>
+          </w:p>
+        </w:tc>
+        <w:tc>
+          <w:tcPr/>
+          <w:p>
+            <w:pPr>
+              <w:pStyle w:val="Compact"/>
+              <w:jc w:val="left"/>
+            </w:pPr>
+            <w:r>
+              <w:t xml:space="preserve">LDD Bray II / SSSA</w:t>
+            </w:r>
+          </w:p>
+        </w:tc>
+        <w:tc>
+          <w:tcPr/>
+          <w:p>
+            <w:pPr>
+              <w:pStyle w:val="Compact"/>
+              <w:jc w:val="left"/>
+            </w:pPr>
+            <w:r>
+              <w:t xml:space="preserve">เหลืองใสอมเขียวจาง (Pale Clear)</w:t>
+            </w:r>
+          </w:p>
+        </w:tc>
+        <w:tc>
+          <w:tcPr/>
+          <w:p>
+            <w:pPr>
+              <w:pStyle w:val="Compact"/>
+              <w:jc w:val="center"/>
+            </w:pPr>
+            <w:r>
+              <w:rPr>
+                <w:rStyle w:val="VerbatimChar"/>
+              </w:rPr>
+              <w:t xml:space="preserve">#faf0ca</w:t>
+            </w:r>
+          </w:p>
+        </w:tc>
+      </w:tr>
+      <w:tr>
+        <w:tc>
+          <w:tcPr/>
+          <w:p>
+            <w:pPr>
+              <w:pStyle w:val="Compact"/>
+              <w:jc w:val="left"/>
+            </w:pPr>
+            <w:r>
+              <w:t xml:space="preserve">(Available P)</w:t>
+            </w:r>
+          </w:p>
+        </w:tc>
+        <w:tc>
+          <w:tcPr/>
+          <w:p>
+            <w:pPr>
+              <w:pStyle w:val="Compact"/>
+              <w:jc w:val="left"/>
+            </w:pPr>
+            <w:r>
+              <w:t xml:space="preserve">ต่ำ (Deficient / Low)</w:t>
+            </w:r>
+          </w:p>
+        </w:tc>
+        <w:tc>
+          <w:tcPr/>
+          <w:p>
+            <w:pPr>
+              <w:pStyle w:val="Compact"/>
+              <w:jc w:val="center"/>
+            </w:pPr>
+            <m:oMath>
+              <m:r>
+                <m:t>5</m:t>
+              </m:r>
+              <m:r>
+                <m:rPr>
+                  <m:sty m:val="p"/>
+                </m:rPr>
+                <m:t>−</m:t>
+              </m:r>
+              <m:r>
+                <m:t>15</m:t>
+              </m:r>
+              <m:r>
+                <m:rPr>
+                  <m:nor/>
+                  <m:sty m:val="p"/>
+                </m:rPr>
+                <m:t> mg/kg</m:t>
+              </m:r>
+            </m:oMath>
+            <w:r>
+              <w:t xml:space="preserve">​</w:t>
+            </w:r>
+          </w:p>
+        </w:tc>
+        <w:tc>
+          <w:tcPr/>
+          <w:p>
+            <w:pPr>
+              <w:pStyle w:val="Compact"/>
+              <w:jc w:val="left"/>
+            </w:pPr>
+            <w:r>
+              <w:t xml:space="preserve">LDD Bray II / SSSA</w:t>
+            </w:r>
+          </w:p>
+        </w:tc>
+        <w:tc>
+          <w:tcPr/>
+          <w:p>
+            <w:pPr>
+              <w:pStyle w:val="Compact"/>
+              <w:jc w:val="left"/>
+            </w:pPr>
+            <w:r>
+              <w:t xml:space="preserve">ฟ้าอ่อนใส (Pale Sky Blue)</w:t>
+            </w:r>
+          </w:p>
+        </w:tc>
+        <w:tc>
+          <w:tcPr/>
+          <w:p>
+            <w:pPr>
+              <w:pStyle w:val="Compact"/>
+              <w:jc w:val="center"/>
+            </w:pPr>
+            <w:r>
+              <w:rPr>
+                <w:rStyle w:val="VerbatimChar"/>
+              </w:rPr>
+              <w:t xml:space="preserve">#a2d2ff</w:t>
+            </w:r>
+          </w:p>
+        </w:tc>
+      </w:tr>
+      <w:tr>
+        <w:tc>
+          <w:tcPr/>
+          <w:p>
+            <w:pPr>
+              <w:pStyle w:val="Compact"/>
+            </w:pPr>
+          </w:p>
+        </w:tc>
+        <w:tc>
+          <w:tcPr/>
+          <w:p>
+            <w:pPr>
+              <w:pStyle w:val="Compact"/>
+              <w:jc w:val="left"/>
+            </w:pPr>
+            <w:r>
+              <w:t xml:space="preserve">ปานกลาง (Adequate / Medium)</w:t>
+            </w:r>
+          </w:p>
+        </w:tc>
+        <w:tc>
+          <w:tcPr/>
+          <w:p>
+            <w:pPr>
+              <w:pStyle w:val="Compact"/>
+              <w:jc w:val="center"/>
+            </w:pPr>
+            <m:oMath>
+              <m:r>
+                <m:t>16</m:t>
+              </m:r>
+              <m:r>
+                <m:rPr>
+                  <m:sty m:val="p"/>
+                </m:rPr>
+                <m:t>−</m:t>
+              </m:r>
+              <m:r>
+                <m:t>30</m:t>
+              </m:r>
+              <m:r>
+                <m:rPr>
+                  <m:nor/>
+                  <m:sty m:val="p"/>
+                </m:rPr>
+                <m:t> mg/kg</m:t>
+              </m:r>
+            </m:oMath>
+            <w:r>
+              <w:t xml:space="preserve">​</w:t>
+            </w:r>
+          </w:p>
+        </w:tc>
+        <w:tc>
+          <w:tcPr/>
+          <w:p>
+            <w:pPr>
+              <w:pStyle w:val="Compact"/>
+              <w:jc w:val="left"/>
+            </w:pPr>
+            <w:r>
+              <w:t xml:space="preserve">LDD Bray II / SSSA</w:t>
+            </w:r>
+          </w:p>
+        </w:tc>
+        <w:tc>
+          <w:tcPr/>
+          <w:p>
+            <w:pPr>
+              <w:pStyle w:val="Compact"/>
+              <w:jc w:val="left"/>
+            </w:pPr>
+            <w:r>
+              <w:t xml:space="preserve">ฟ้าครามมิดเดิลบลู (Cyan Blue)</w:t>
+            </w:r>
+          </w:p>
+        </w:tc>
+        <w:tc>
+          <w:tcPr/>
+          <w:p>
+            <w:pPr>
+              <w:pStyle w:val="Compact"/>
+              <w:jc w:val="center"/>
+            </w:pPr>
+            <w:r>
+              <w:rPr>
+                <w:rStyle w:val="VerbatimChar"/>
+              </w:rPr>
+              <w:t xml:space="preserve">#3a86ff</w:t>
+            </w:r>
+          </w:p>
+        </w:tc>
+      </w:tr>
+      <w:tr>
+        <w:tc>
+          <w:tcPr/>
+          <w:p>
+            <w:pPr>
+              <w:pStyle w:val="Compact"/>
+            </w:pPr>
+          </w:p>
+        </w:tc>
+        <w:tc>
+          <w:tcPr/>
+          <w:p>
+            <w:pPr>
+              <w:pStyle w:val="Compact"/>
+              <w:jc w:val="left"/>
+            </w:pPr>
+            <w:r>
+              <w:t xml:space="preserve">สูง (Sufficient / High)</w:t>
+            </w:r>
+          </w:p>
+        </w:tc>
+        <w:tc>
+          <w:tcPr/>
+          <w:p>
+            <w:pPr>
+              <w:pStyle w:val="Compact"/>
+              <w:jc w:val="center"/>
+            </w:pPr>
+            <m:oMath>
+              <m:r>
+                <m:t>31</m:t>
+              </m:r>
+              <m:r>
+                <m:rPr>
+                  <m:sty m:val="p"/>
+                </m:rPr>
+                <m:t>−</m:t>
+              </m:r>
+              <m:r>
+                <m:t>60</m:t>
+              </m:r>
+              <m:r>
+                <m:rPr>
+                  <m:nor/>
+                  <m:sty m:val="p"/>
+                </m:rPr>
+                <m:t> mg/kg</m:t>
+              </m:r>
+            </m:oMath>
+            <w:r>
+              <w:t xml:space="preserve">​</w:t>
+            </w:r>
+          </w:p>
+        </w:tc>
+        <w:tc>
+          <w:tcPr/>
+          <w:p>
+            <w:pPr>
+              <w:pStyle w:val="Compact"/>
+              <w:jc w:val="left"/>
+            </w:pPr>
+            <w:r>
+              <w:t xml:space="preserve">LDD Bray II / SSSA</w:t>
+            </w:r>
+          </w:p>
+        </w:tc>
+        <w:tc>
+          <w:tcPr/>
+          <w:p>
+            <w:pPr>
+              <w:pStyle w:val="Compact"/>
+              <w:jc w:val="left"/>
+            </w:pPr>
+            <w:r>
+              <w:t xml:space="preserve">น้ำเงินเข้มรอยัลบลู (Royal Blue)</w:t>
+            </w:r>
+          </w:p>
+        </w:tc>
+        <w:tc>
+          <w:tcPr/>
+          <w:p>
+            <w:pPr>
+              <w:pStyle w:val="Compact"/>
+              <w:jc w:val="center"/>
+            </w:pPr>
+            <w:r>
+              <w:rPr>
+                <w:rStyle w:val="VerbatimChar"/>
+              </w:rPr>
+              <w:t xml:space="preserve">#003049</w:t>
+            </w:r>
+          </w:p>
+        </w:tc>
+      </w:tr>
+      <w:tr>
+        <w:tc>
+          <w:tcPr/>
+          <w:p>
+            <w:pPr>
+              <w:pStyle w:val="Compact"/>
+            </w:pPr>
+          </w:p>
+        </w:tc>
+        <w:tc>
+          <w:tcPr/>
+          <w:p>
+            <w:pPr>
+              <w:pStyle w:val="Compact"/>
+              <w:jc w:val="left"/>
+            </w:pPr>
+            <w:r>
+              <w:t xml:space="preserve">สูงมาก (Surplus / Very High)</w:t>
+            </w:r>
+          </w:p>
+        </w:tc>
+        <w:tc>
+          <w:tcPr/>
+          <w:p>
+            <w:pPr>
+              <w:pStyle w:val="Compact"/>
+              <w:jc w:val="center"/>
+            </w:pPr>
+            <m:oMath>
+              <m:r>
+                <m:rPr>
+                  <m:sty m:val="p"/>
+                </m:rPr>
+                <m:t>&gt;</m:t>
+              </m:r>
+              <m:r>
+                <m:t>60</m:t>
+              </m:r>
+              <m:r>
+                <m:rPr>
+                  <m:nor/>
+                  <m:sty m:val="p"/>
+                </m:rPr>
+                <m:t> mg/kg</m:t>
+              </m:r>
+            </m:oMath>
+            <w:r>
+              <w:t xml:space="preserve">​</w:t>
+            </w:r>
+          </w:p>
+        </w:tc>
+        <w:tc>
+          <w:tcPr/>
+          <w:p>
+            <w:pPr>
+              <w:pStyle w:val="Compact"/>
+              <w:jc w:val="left"/>
+            </w:pPr>
+            <w:r>
+              <w:t xml:space="preserve">LDD Bray II / SSSA</w:t>
+            </w:r>
+          </w:p>
+        </w:tc>
+        <w:tc>
+          <w:tcPr/>
+          <w:p>
+            <w:pPr>
+              <w:pStyle w:val="Compact"/>
+              <w:jc w:val="left"/>
+            </w:pPr>
+            <w:r>
+              <w:t xml:space="preserve">น้ำเงินมิดไนท์บลู (Midnight Navy)</w:t>
+            </w:r>
+          </w:p>
+        </w:tc>
+        <w:tc>
+          <w:tcPr/>
+          <w:p>
+            <w:pPr>
+              <w:pStyle w:val="Compact"/>
+              <w:jc w:val="center"/>
+            </w:pPr>
+            <w:r>
+              <w:rPr>
+                <w:rStyle w:val="VerbatimChar"/>
+              </w:rPr>
+              <w:t xml:space="preserve">#03045e</w:t>
+            </w:r>
+          </w:p>
+        </w:tc>
+      </w:tr>
+      <w:tr>
+        <w:tc>
+          <w:tcPr/>
+          <w:p>
+            <w:pPr>
+              <w:pStyle w:val="Compact"/>
+              <w:jc w:val="left"/>
+            </w:pPr>
+            <w:r>
+              <w:rPr>
+                <w:b/>
+                <w:bCs/>
+              </w:rPr>
+              <w:t xml:space="preserve">โพแทสเซียมที่แลกเปลี่ยนได้</w:t>
+            </w:r>
+          </w:p>
+        </w:tc>
+        <w:tc>
+          <w:tcPr/>
+          <w:p>
+            <w:pPr>
+              <w:pStyle w:val="Compact"/>
+              <w:jc w:val="left"/>
+            </w:pPr>
+            <w:r>
+              <w:t xml:space="preserve">ต่ำมาก (Depleted / Very Low)</w:t>
+            </w:r>
+          </w:p>
+        </w:tc>
+        <w:tc>
+          <w:tcPr/>
+          <w:p>
+            <w:pPr>
+              <w:pStyle w:val="Compact"/>
+              <w:jc w:val="center"/>
+            </w:pPr>
+            <m:oMath>
+              <m:r>
+                <m:rPr>
+                  <m:sty m:val="p"/>
+                </m:rPr>
+                <m:t>&lt;</m:t>
+              </m:r>
+              <m:r>
+                <m:t>40</m:t>
+              </m:r>
+              <m:r>
+                <m:rPr>
+                  <m:nor/>
+                  <m:sty m:val="p"/>
+                </m:rPr>
+                <m:t> mg/kg</m:t>
+              </m:r>
+            </m:oMath>
+            <w:r>
+              <w:t xml:space="preserve">​</w:t>
+            </w:r>
+          </w:p>
+        </w:tc>
+        <w:tc>
+          <w:tcPr/>
+          <w:p>
+            <w:pPr>
+              <w:pStyle w:val="Compact"/>
+              <w:jc w:val="left"/>
+            </w:pPr>
+            <w:r>
+              <w:t xml:space="preserve">LDD / SSSA</w:t>
+            </w:r>
+          </w:p>
+        </w:tc>
+        <w:tc>
+          <w:tcPr/>
+          <w:p>
+            <w:pPr>
+              <w:pStyle w:val="Compact"/>
+              <w:jc w:val="left"/>
+            </w:pPr>
+            <w:r>
+              <w:t xml:space="preserve">สารละลายใสไร้ตะกอน (Clear)</w:t>
+            </w:r>
+          </w:p>
+        </w:tc>
+        <w:tc>
+          <w:tcPr/>
+          <w:p>
+            <w:pPr>
+              <w:pStyle w:val="Compact"/>
+              <w:jc w:val="center"/>
+            </w:pPr>
+            <w:r>
+              <w:rPr>
+                <w:rStyle w:val="VerbatimChar"/>
+              </w:rPr>
+              <w:t xml:space="preserve">#edf2f4</w:t>
+            </w:r>
+          </w:p>
+        </w:tc>
+      </w:tr>
+      <w:tr>
+        <w:tc>
+          <w:tcPr/>
+          <w:p>
+            <w:pPr>
+              <w:pStyle w:val="Compact"/>
+              <w:jc w:val="left"/>
+            </w:pPr>
+            <w:r>
+              <w:t xml:space="preserve">(Exchangeable K)</w:t>
+            </w:r>
+          </w:p>
+        </w:tc>
+        <w:tc>
+          <w:tcPr/>
+          <w:p>
+            <w:pPr>
+              <w:pStyle w:val="Compact"/>
+              <w:jc w:val="left"/>
+            </w:pPr>
+            <w:r>
+              <w:t xml:space="preserve">ต่ำ (Deficient / Low)</w:t>
+            </w:r>
+          </w:p>
+        </w:tc>
+        <w:tc>
+          <w:tcPr/>
+          <w:p>
+            <w:pPr>
+              <w:pStyle w:val="Compact"/>
+              <w:jc w:val="center"/>
+            </w:pPr>
+            <m:oMath>
+              <m:r>
+                <m:t>40</m:t>
+              </m:r>
+              <m:r>
+                <m:rPr>
+                  <m:sty m:val="p"/>
+                </m:rPr>
+                <m:t>−</m:t>
+              </m:r>
+              <m:r>
+                <m:t>80</m:t>
+              </m:r>
+              <m:r>
+                <m:rPr>
+                  <m:nor/>
+                  <m:sty m:val="p"/>
+                </m:rPr>
+                <m:t> mg/kg</m:t>
+              </m:r>
+            </m:oMath>
+            <w:r>
+              <w:t xml:space="preserve">​</w:t>
+            </w:r>
+          </w:p>
+        </w:tc>
+        <w:tc>
+          <w:tcPr/>
+          <w:p>
+            <w:pPr>
+              <w:pStyle w:val="Compact"/>
+              <w:jc w:val="left"/>
+            </w:pPr>
+            <w:r>
+              <w:t xml:space="preserve">LDD / SSSA</w:t>
+            </w:r>
+          </w:p>
+        </w:tc>
+        <w:tc>
+          <w:tcPr/>
+          <w:p>
+            <w:pPr>
+              <w:pStyle w:val="Compact"/>
+              <w:jc w:val="left"/>
+            </w:pPr>
+            <w:r>
+              <w:t xml:space="preserve">ขุ่นมัวฝ้าจางๆ (Hazy Amber)</w:t>
+            </w:r>
+          </w:p>
+        </w:tc>
+        <w:tc>
+          <w:tcPr/>
+          <w:p>
+            <w:pPr>
+              <w:pStyle w:val="Compact"/>
+              <w:jc w:val="center"/>
+            </w:pPr>
+            <w:r>
+              <w:rPr>
+                <w:rStyle w:val="VerbatimChar"/>
+              </w:rPr>
+              <w:t xml:space="preserve">#ffd166</w:t>
+            </w:r>
+          </w:p>
+        </w:tc>
+      </w:tr>
+      <w:tr>
+        <w:tc>
+          <w:tcPr/>
+          <w:p>
+            <w:pPr>
+              <w:pStyle w:val="Compact"/>
+            </w:pPr>
+          </w:p>
+        </w:tc>
+        <w:tc>
+          <w:tcPr/>
+          <w:p>
+            <w:pPr>
+              <w:pStyle w:val="Compact"/>
+              <w:jc w:val="left"/>
+            </w:pPr>
+            <w:r>
+              <w:t xml:space="preserve">ปานกลาง (Adequate / Medium)</w:t>
+            </w:r>
+          </w:p>
+        </w:tc>
+        <w:tc>
+          <w:tcPr/>
+          <w:p>
+            <w:pPr>
+              <w:pStyle w:val="Compact"/>
+              <w:jc w:val="center"/>
+            </w:pPr>
+            <m:oMath>
+              <m:r>
+                <m:t>81</m:t>
+              </m:r>
+              <m:r>
+                <m:rPr>
+                  <m:sty m:val="p"/>
+                </m:rPr>
+                <m:t>−</m:t>
+              </m:r>
+              <m:r>
+                <m:t>150</m:t>
+              </m:r>
+              <m:r>
+                <m:rPr>
+                  <m:nor/>
+                  <m:sty m:val="p"/>
+                </m:rPr>
+                <m:t> mg/kg</m:t>
+              </m:r>
+            </m:oMath>
+            <w:r>
+              <w:t xml:space="preserve">​</w:t>
+            </w:r>
+          </w:p>
+        </w:tc>
+        <w:tc>
+          <w:tcPr/>
+          <w:p>
+            <w:pPr>
+              <w:pStyle w:val="Compact"/>
+              <w:jc w:val="left"/>
+            </w:pPr>
+            <w:r>
+              <w:t xml:space="preserve">LDD / SSSA</w:t>
+            </w:r>
+          </w:p>
+        </w:tc>
+        <w:tc>
+          <w:tcPr/>
+          <w:p>
+            <w:pPr>
+              <w:pStyle w:val="Compact"/>
+              <w:jc w:val="left"/>
+            </w:pPr>
+            <w:r>
+              <w:t xml:space="preserve">ขุ่นส้มทองคำ (Golden Orange)</w:t>
+            </w:r>
+          </w:p>
+        </w:tc>
+        <w:tc>
+          <w:tcPr/>
+          <w:p>
+            <w:pPr>
+              <w:pStyle w:val="Compact"/>
+              <w:jc w:val="center"/>
+            </w:pPr>
+            <w:r>
+              <w:rPr>
+                <w:rStyle w:val="VerbatimChar"/>
+              </w:rPr>
+              <w:t xml:space="preserve">#f3722c</w:t>
+            </w:r>
+          </w:p>
+        </w:tc>
+      </w:tr>
+      <w:tr>
+        <w:tc>
+          <w:tcPr/>
+          <w:p>
+            <w:pPr>
+              <w:pStyle w:val="Compact"/>
+            </w:pPr>
+          </w:p>
+        </w:tc>
+        <w:tc>
+          <w:tcPr/>
+          <w:p>
+            <w:pPr>
+              <w:pStyle w:val="Compact"/>
+              <w:jc w:val="left"/>
+            </w:pPr>
+            <w:r>
+              <w:t xml:space="preserve">สูง (Sufficient / High)</w:t>
+            </w:r>
+          </w:p>
+        </w:tc>
+        <w:tc>
+          <w:tcPr/>
+          <w:p>
+            <w:pPr>
+              <w:pStyle w:val="Compact"/>
+              <w:jc w:val="center"/>
+            </w:pPr>
+            <m:oMath>
+              <m:r>
+                <m:t>151</m:t>
+              </m:r>
+              <m:r>
+                <m:rPr>
+                  <m:sty m:val="p"/>
+                </m:rPr>
+                <m:t>−</m:t>
+              </m:r>
+              <m:r>
+                <m:t>250</m:t>
+              </m:r>
+              <m:r>
+                <m:rPr>
+                  <m:nor/>
+                  <m:sty m:val="p"/>
+                </m:rPr>
+                <m:t> mg/kg</m:t>
+              </m:r>
+            </m:oMath>
+            <w:r>
+              <w:t xml:space="preserve">​</w:t>
+            </w:r>
+          </w:p>
+        </w:tc>
+        <w:tc>
+          <w:tcPr/>
+          <w:p>
+            <w:pPr>
+              <w:pStyle w:val="Compact"/>
+              <w:jc w:val="left"/>
+            </w:pPr>
+            <w:r>
+              <w:t xml:space="preserve">LDD / SSSA</w:t>
+            </w:r>
+          </w:p>
+        </w:tc>
+        <w:tc>
+          <w:tcPr/>
+          <w:p>
+            <w:pPr>
+              <w:pStyle w:val="Compact"/>
+              <w:jc w:val="left"/>
+            </w:pPr>
+            <w:r>
+              <w:t xml:space="preserve">ตะกอนส้มแดงขุ่น (Dense Orange)</w:t>
+            </w:r>
+          </w:p>
+        </w:tc>
+        <w:tc>
+          <w:tcPr/>
+          <w:p>
+            <w:pPr>
+              <w:pStyle w:val="Compact"/>
+              <w:jc w:val="center"/>
+            </w:pPr>
+            <w:r>
+              <w:rPr>
+                <w:rStyle w:val="VerbatimChar"/>
+              </w:rPr>
+              <w:t xml:space="preserve">#d90429</w:t>
+            </w:r>
+          </w:p>
+        </w:tc>
+      </w:tr>
+      <w:tr>
+        <w:tc>
+          <w:tcPr/>
+          <w:p>
+            <w:pPr>
+              <w:pStyle w:val="Compact"/>
+            </w:pPr>
+          </w:p>
+        </w:tc>
+        <w:tc>
+          <w:tcPr/>
+          <w:p>
+            <w:pPr>
+              <w:pStyle w:val="Compact"/>
+              <w:jc w:val="left"/>
+            </w:pPr>
+            <w:r>
+              <w:t xml:space="preserve">สูงมาก (Surplus / Very High)</w:t>
+            </w:r>
+          </w:p>
+        </w:tc>
+        <w:tc>
+          <w:tcPr/>
+          <w:p>
+            <w:pPr>
+              <w:pStyle w:val="Compact"/>
+              <w:jc w:val="center"/>
+            </w:pPr>
+            <m:oMath>
+              <m:r>
+                <m:rPr>
+                  <m:sty m:val="p"/>
+                </m:rPr>
+                <m:t>&gt;</m:t>
+              </m:r>
+              <m:r>
+                <m:t>250</m:t>
+              </m:r>
+              <m:r>
+                <m:rPr>
+                  <m:nor/>
+                  <m:sty m:val="p"/>
+                </m:rPr>
+                <m:t> mg/kg</m:t>
+              </m:r>
+            </m:oMath>
+            <w:r>
+              <w:t xml:space="preserve">​</w:t>
+            </w:r>
+          </w:p>
+        </w:tc>
+        <w:tc>
+          <w:tcPr/>
+          <w:p>
+            <w:pPr>
+              <w:pStyle w:val="Compact"/>
+              <w:jc w:val="left"/>
+            </w:pPr>
+            <w:r>
+              <w:t xml:space="preserve">LDD / SSSA</w:t>
+            </w:r>
+          </w:p>
+        </w:tc>
+        <w:tc>
+          <w:tcPr/>
+          <w:p>
+            <w:pPr>
+              <w:pStyle w:val="Compact"/>
+              <w:jc w:val="left"/>
+            </w:pPr>
+            <w:r>
+              <w:t xml:space="preserve">ตะกอนทึบแสงหนาแน่น (Opaque)</w:t>
+            </w:r>
+          </w:p>
+        </w:tc>
+        <w:tc>
+          <w:tcPr/>
+          <w:p>
+            <w:pPr>
+              <w:pStyle w:val="Compact"/>
+              <w:jc w:val="center"/>
+            </w:pPr>
+            <w:r>
+              <w:rPr>
+                <w:rStyle w:val="VerbatimChar"/>
+              </w:rPr>
+              <w:t xml:space="preserve">#6a040f</w:t>
+            </w:r>
+          </w:p>
+        </w:tc>
+      </w:tr>
+    </w:tbl>
+    <w:bookmarkEnd w:id="33"/>
+    <w:bookmarkStart w:id="34" w:name="Xf4fef1172dee9c1f76b70751df61f2893656285"/>
+    <w:p>
+      <w:pPr>
+        <w:pStyle w:val="Heading3"/>
+      </w:pPr>
+      <w:r>
+        <w:t xml:space="preserve">2.7.4 ข้อจำกัดของการอ่านแถบสีด้วยสายตามนุษย์และที่มาของการพัฒนาระบบทัศนศาสตร์ออปติคอล</w:t>
+      </w:r>
+    </w:p>
+    <w:p>
+      <w:pPr>
+        <w:pStyle w:val="FirstParagraph"/>
+      </w:pPr>
+      <w:r>
+        <w:t xml:space="preserve">แม้ว่าชุดทดสอบดินทางเคมีแบบแถบสีจะมีประโยชน์อย่างยิ่งในการประเมินระดับธาตุอาหารภาคสนาม แต่การใช้งานจริงยังคงประสบกับข้อจำกัดทางวิทยาศาสตร์ 4 ประการ ได้แก่</w:t>
+      </w:r>
+    </w:p>
+    <w:p>
+      <w:pPr>
+        <w:pStyle w:val="Compact"/>
+        <w:numPr>
+          <w:ilvl w:val="0"/>
+          <w:numId w:val="1005"/>
+        </w:numPr>
+      </w:pPr>
+      <w:r>
+        <w:rPr>
+          <w:b/>
+          <w:bCs/>
+        </w:rPr>
+        <w:t xml:space="preserve">ความแปรปรวนจากสายตาและอัตวิสัยของผู้ประเมิน (Subjectivity and Eye Fatigue)</w:t>
+      </w:r>
+      <w:r>
+        <w:t xml:space="preserve"> </w:t>
+      </w:r>
+      <w:r>
+        <w:t xml:space="preserve">ความสามารถในการแยกแยะเฉดสีของมนุษย์มีความแตกต่างกันในแต่ละบุคคล และเมื่อต้องตรวจวัดตัวอย่างจำนวนมากในแปลงเกษตรกรรม สายตาจะเกิดอาการล้า ส่งผลให้เกิดความคลาดเคลื่อนในการจำแนกระดับคุณภาพดิน โดยเฉพาะตัวอย่างที่ตกอยู่บริเวณรอยต่อของสองระดับสี</w:t>
+      </w:r>
+    </w:p>
+    <w:p>
+      <w:pPr>
+        <w:pStyle w:val="Compact"/>
+        <w:numPr>
+          <w:ilvl w:val="0"/>
+          <w:numId w:val="1005"/>
+        </w:numPr>
+      </w:pPr>
+      <w:r>
+        <w:rPr>
+          <w:b/>
+          <w:bCs/>
+        </w:rPr>
+        <w:t xml:space="preserve">ผลกระทบจากความเข้มและอุณหภูมิสีของแสงแวดล้อม (Ambient Lux and Metamerism)</w:t>
+      </w:r>
+      <w:r>
+        <w:t xml:space="preserve"> </w:t>
+      </w:r>
+      <w:r>
+        <w:t xml:space="preserve">การอ่านแถบสีภายใต้สภาพแสงธรรมชาติที่แตกต่างกัน เช่น แสงแดดจัดช่วงเที่ยงวัน แสงร่มเงาใต้ต้นไม้ หรือแสงยามเย็น จะทำให้สเปกตรัมของแสงสะท้อนเปลี่ยนไป (Metameric Failure) ส่งผลให้เฉดสีที่ตามองเห็นบิดเบือนไปจากความเป็นจริง</w:t>
+      </w:r>
+    </w:p>
+    <w:p>
+      <w:pPr>
+        <w:pStyle w:val="Compact"/>
+        <w:numPr>
+          <w:ilvl w:val="0"/>
+          <w:numId w:val="1005"/>
+        </w:numPr>
+      </w:pPr>
+      <w:r>
+        <w:rPr>
+          <w:b/>
+          <w:bCs/>
+        </w:rPr>
+        <w:t xml:space="preserve">การใช้สารเคมีอันตรายและของเสียปนเปื้อน (Hazardous Chemical Waste)</w:t>
+      </w:r>
+      <w:r>
+        <w:t xml:space="preserve"> </w:t>
+      </w:r>
+      <w:r>
+        <w:t xml:space="preserve">การทดสอบทางเคมีทุกครั้งต้องใช้กรดแก่ ตัวทำละลาย และสารเชื่อมไดอะโซ ซึ่งมีความเป็นพิษต่อผู้ใช้งานและจำเป็นต้องมีระบบกำจัดของเสียสารเคมีที่ถูกต้องเพื่อไม่ให้ปนเปื้อนสู่แปลงเกษตรกรรม</w:t>
+      </w:r>
+    </w:p>
+    <w:p>
+      <w:pPr>
+        <w:pStyle w:val="Compact"/>
+        <w:numPr>
+          <w:ilvl w:val="0"/>
+          <w:numId w:val="1005"/>
+        </w:numPr>
+      </w:pPr>
+      <w:r>
+        <w:rPr>
+          <w:b/>
+          <w:bCs/>
+        </w:rPr>
+        <w:t xml:space="preserve">การขาดข้อมูลเชิงปริมาณความละเอียดสูง (Lack of Continuous Quantitative Values)</w:t>
+      </w:r>
+      <w:r>
+        <w:t xml:space="preserve"> </w:t>
+      </w:r>
+      <w:r>
+        <w:t xml:space="preserve">แถบสีสามารถบอกได้เพียงช่วงกว้างเชิงกลุ่ม (Categorical Range) เช่น</w:t>
+      </w:r>
+      <w:r>
+        <w:t xml:space="preserve"> </w:t>
+      </w:r>
+      <w:r>
+        <w:t xml:space="preserve">“ต่ำ”</w:t>
+      </w:r>
+      <w:r>
+        <w:t xml:space="preserve"> </w:t>
+      </w:r>
+      <w:r>
+        <w:t xml:space="preserve">หรือ</w:t>
+      </w:r>
+      <w:r>
+        <w:t xml:space="preserve"> </w:t>
+      </w:r>
+      <w:r>
+        <w:t xml:space="preserve">“ปานกลาง”</w:t>
+      </w:r>
+      <w:r>
+        <w:t xml:space="preserve"> </w:t>
+      </w:r>
+      <w:r>
+        <w:t xml:space="preserve">แต่ไม่สามารถระบุค่าตัวเลขความเข้มข้นที่แม่นยำในหน่วย</w:t>
+      </w:r>
+      <w:r>
+        <w:t xml:space="preserve"> </w:t>
+      </w:r>
+      <m:oMath>
+        <m:r>
+          <m:rPr>
+            <m:nor/>
+            <m:sty m:val="p"/>
+          </m:rPr>
+          <m:t>mg/kg</m:t>
+        </m:r>
+      </m:oMath>
+      <w:r>
+        <w:t xml:space="preserve"> </w:t>
+      </w:r>
+      <w:r>
+        <w:t xml:space="preserve">ได้ ทำให้ไม่สามารถนำไปคำนวณปริมาณปุ๋ยเคมีรายต้นตามหลักการเกษตรแม่นยำสูง (Variable Rate Fertilization) ได้อย่างสมบูรณ์</w:t>
+      </w:r>
+    </w:p>
+    <w:p>
+      <w:pPr>
+        <w:pStyle w:val="FirstParagraph"/>
+      </w:pPr>
+      <w:r>
+        <w:t xml:space="preserve">ข้อจำกัดข้างต้นจึงเป็นแรงขับเคลื่อนสำคัญที่นำไปสู่โจทย์วิจัยในการออกแบบชุดวิเคราะห์ที่ใช้</w:t>
+      </w:r>
+      <w:r>
+        <w:t xml:space="preserve"> </w:t>
+      </w:r>
+      <w:r>
+        <w:rPr>
+          <w:b/>
+          <w:bCs/>
+        </w:rPr>
+        <w:t xml:space="preserve">หลักการสะท้อนแสงแบบกระจาย (Diffuse Reflectance) ภายในกล่องควบคุมสภาพแสงระบบปิด (Optical Dark Chamber)</w:t>
+      </w:r>
+      <w:r>
+        <w:t xml:space="preserve"> </w:t>
+      </w:r>
+      <w:r>
+        <w:t xml:space="preserve">ร่วมกับการกระตุ้นแสงหลายความยาวคลื่น และการใช้</w:t>
+      </w:r>
+      <w:r>
+        <w:t xml:space="preserve"> </w:t>
+      </w:r>
+      <w:r>
+        <w:rPr>
+          <w:b/>
+          <w:bCs/>
+        </w:rPr>
+        <w:t xml:space="preserve">แบบจำลองปัญญาประดิษฐ์ (Artificial Intelligence)</w:t>
+      </w:r>
+      <w:r>
+        <w:t xml:space="preserve"> </w:t>
+      </w:r>
+      <w:r>
+        <w:t xml:space="preserve">เพื่อทำนายปริมาณธาตุอาหารออกมาเป็นค่าตัวเลขเชิงปริมาณที่แม่นยำเทียบเท่าห้องปฏิบัติการ พร้อมทั้งสามารถสร้างแถบสีดิจิทัลมาตรฐาน (Digital Color Badge Chip) แสดงผลคู่ขนานกันได้อย่างมีประสิทธิภาพ</w:t>
+      </w:r>
+    </w:p>
+    <w:bookmarkEnd w:id="34"/>
+    <w:bookmarkEnd w:id="35"/>
+    <w:bookmarkEnd w:id="36"/>
     <w:sectPr>
       <w:footnotePr>
         <w:numRestart w:val="eachSect"/>
@@ -3138,6 +7541,66 @@
     </w:lvlOverride>
   </w:num>
   <w:num w:numId="1003">
+    <w:abstractNumId w:val="99411"/>
+    <w:lvlOverride w:ilvl="0">
+      <w:startOverride w:val="1"/>
+    </w:lvlOverride>
+    <w:lvlOverride w:ilvl="1">
+      <w:startOverride w:val="1"/>
+    </w:lvlOverride>
+    <w:lvlOverride w:ilvl="2">
+      <w:startOverride w:val="1"/>
+    </w:lvlOverride>
+    <w:lvlOverride w:ilvl="3">
+      <w:startOverride w:val="1"/>
+    </w:lvlOverride>
+    <w:lvlOverride w:ilvl="4">
+      <w:startOverride w:val="1"/>
+    </w:lvlOverride>
+    <w:lvlOverride w:ilvl="5">
+      <w:startOverride w:val="1"/>
+    </w:lvlOverride>
+    <w:lvlOverride w:ilvl="6">
+      <w:startOverride w:val="1"/>
+    </w:lvlOverride>
+    <w:lvlOverride w:ilvl="7">
+      <w:startOverride w:val="1"/>
+    </w:lvlOverride>
+    <w:lvlOverride w:ilvl="8">
+      <w:startOverride w:val="1"/>
+    </w:lvlOverride>
+  </w:num>
+  <w:num w:numId="1004">
+    <w:abstractNumId w:val="99411"/>
+    <w:lvlOverride w:ilvl="0">
+      <w:startOverride w:val="1"/>
+    </w:lvlOverride>
+    <w:lvlOverride w:ilvl="1">
+      <w:startOverride w:val="1"/>
+    </w:lvlOverride>
+    <w:lvlOverride w:ilvl="2">
+      <w:startOverride w:val="1"/>
+    </w:lvlOverride>
+    <w:lvlOverride w:ilvl="3">
+      <w:startOverride w:val="1"/>
+    </w:lvlOverride>
+    <w:lvlOverride w:ilvl="4">
+      <w:startOverride w:val="1"/>
+    </w:lvlOverride>
+    <w:lvlOverride w:ilvl="5">
+      <w:startOverride w:val="1"/>
+    </w:lvlOverride>
+    <w:lvlOverride w:ilvl="6">
+      <w:startOverride w:val="1"/>
+    </w:lvlOverride>
+    <w:lvlOverride w:ilvl="7">
+      <w:startOverride w:val="1"/>
+    </w:lvlOverride>
+    <w:lvlOverride w:ilvl="8">
+      <w:startOverride w:val="1"/>
+    </w:lvlOverride>
+  </w:num>
+  <w:num w:numId="1005">
     <w:abstractNumId w:val="99411"/>
     <w:lvlOverride w:ilvl="0">
       <w:startOverride w:val="1"/>

</xml_diff>